<commit_message>
eCRF's afgewerkt: Appendix-nummers gefixt, tracked changes/opmerkingen verwijderd, headers/footers uniform (naam + PARADISE/S71769 + paginanummering); oude eCRF-documenten-map vervangen door bijgewerkte (e)CRF-structuur
</commit_message>
<xml_diff>
--- a/(e)CRF/Per nummer/01_Screening voor toestemming.docx
+++ b/(e)CRF/Per nummer/01_Screening voor toestemming.docx
@@ -69,7 +69,6 @@
         </w:rPr>
         <w:t xml:space="preserve"> patient</w:t>
       </w:r>
-      <w:commentRangeStart w:id="0"/>
       <w:r>
         <w:rPr>
           <w:rFonts w:ascii="Arial" w:hAnsi="Arial" w:cs="Arial" w:eastAsia="Arial"/>
@@ -81,20 +80,6 @@
           <w:lang w:val="en-GB"/>
         </w:rPr>
         <w:t>:</w:t>
-      </w:r>
-      <w:commentRangeEnd w:id="0"/>
-      <w:r>
-        <w:rPr>
-          <w:rStyle w:val="Verwijzingopmerking"/>
-          <w:rFonts w:ascii="Arial" w:hAnsi="Arial" w:cs="Arial" w:eastAsia="Arial"/>
-          <w:b/>
-          <w:bCs/>
-          <w:color w:val="123A5F"/>
-          <w:sz w:val="24"/>
-          <w:szCs w:val="24"/>
-          <w:lang w:val="en-GB"/>
-        </w:rPr>
-        <w:commentReference w:id="0"/>
       </w:r>
       <w:r>
         <w:rPr>
@@ -588,18 +573,6 @@
               </w:rPr>
               <w:t>Beschikt over beschermend schoeisel dat volledig op maat gemaakt is (‘orthopedisch schoeisel’) of bestaat uit op maat gemaakte voetzolen gedragen in semi-orthopedisch schoeisel of adequate confectieschoenen met extra diepte. Indien de patiënt nog niet over dergelijk schoeisel beschikt, moet hij/zij bereid zijn om over te schakelen naar dergelijk beschermend schoeisel (reeds terugbetaald door het RIZIV-INAMI).</w:t>
             </w:r>
-            <w:commentRangeStart w:id="1"/>
-            <w:commentRangeEnd w:id="1"/>
-            <w:r>
-              <w:rPr>
-                <w:rStyle w:val="Verwijzingopmerking"/>
-                <w:rFonts w:ascii="Arial" w:hAnsi="Arial" w:cs="Arial" w:eastAsia="Arial"/>
-                <w:color w:val="24303B"/>
-                <w:sz w:val="22"/>
-                <w:szCs w:val="22"/>
-              </w:rPr>
-              <w:commentReference w:id="1"/>
-            </w:r>
           </w:p>
         </w:tc>
       </w:tr>
@@ -1085,52 +1058,6 @@
 </w:document>
 </file>
 
-<file path=word/comments.xml><?xml version="1.0" encoding="utf-8"?>
-<w:comments xmlns:wpc="http://schemas.microsoft.com/office/word/2010/wordprocessingCanvas" xmlns:cx="http://schemas.microsoft.com/office/drawing/2014/chartex" xmlns:cx1="http://schemas.microsoft.com/office/drawing/2015/9/8/chartex" xmlns:cx2="http://schemas.microsoft.com/office/drawing/2015/10/21/chartex" xmlns:cx3="http://schemas.microsoft.com/office/drawing/2016/5/9/chartex" xmlns:cx4="http://schemas.microsoft.com/office/drawing/2016/5/10/chartex" xmlns:cx5="http://schemas.microsoft.com/office/drawing/2016/5/11/chartex" xmlns:cx6="http://schemas.microsoft.com/office/drawing/2016/5/12/chartex" xmlns:cx7="http://schemas.microsoft.com/office/drawing/2016/5/13/chartex" xmlns:cx8="http://schemas.microsoft.com/office/drawing/2016/5/14/chartex" xmlns:mc="http://schemas.openxmlformats.org/markup-compatibility/2006" xmlns:aink="http://schemas.microsoft.com/office/drawing/2016/ink" xmlns:am3d="http://schemas.microsoft.com/office/drawing/2017/model3d" xmlns:o="urn:schemas-microsoft-com:office:office" xmlns:oel="http://schemas.microsoft.com/office/2019/extlst" xmlns:r="http://schemas.openxmlformats.org/officeDocument/2006/relationships" xmlns:m="http://schemas.openxmlformats.org/officeDocument/2006/math" xmlns:v="urn:schemas-microsoft-com:vml" xmlns:wp14="http://schemas.microsoft.com/office/word/2010/wordprocessingDrawing" xmlns:wp="http://schemas.openxmlformats.org/drawingml/2006/wordprocessingDrawing" xmlns:w10="urn:schemas-microsoft-com:office:word" xmlns:w="http://schemas.openxmlformats.org/wordprocessingml/2006/main" xmlns:w14="http://schemas.microsoft.com/office/word/2010/wordml" xmlns:w15="http://schemas.microsoft.com/office/word/2012/wordml" xmlns:w16cex="http://schemas.microsoft.com/office/word/2018/wordml/cex" xmlns:w16cid="http://schemas.microsoft.com/office/word/2016/wordml/cid" xmlns:w16="http://schemas.microsoft.com/office/word/2018/wordml" xmlns:w16du="http://schemas.microsoft.com/office/word/2023/wordml/word16du" xmlns:w16sdtdh="http://schemas.microsoft.com/office/word/2020/wordml/sdtdatahash" xmlns:w16sdtfl="http://schemas.microsoft.com/office/word/2024/wordml/sdtformatlock" xmlns:w16se="http://schemas.microsoft.com/office/word/2015/wordml/symex" xmlns:wpg="http://schemas.microsoft.com/office/word/2010/wordprocessingGroup" xmlns:wpi="http://schemas.microsoft.com/office/word/2010/wordprocessingInk" xmlns:wne="http://schemas.microsoft.com/office/word/2006/wordml" xmlns:wps="http://schemas.microsoft.com/office/word/2010/wordprocessingShape" mc:Ignorable="w14 w15 w16se w16cid w16 w16cex w16sdtdh w16sdtfl w16du wp14">
-  <w:comment w:id="0" w:author="Fabienne Dobbels" w:date="2026-06-03T09:45:00Z" w:initials="FD">
-    <w:p>
-      <w:r>
-        <w:annotationRef/>
-      </w:r>
-      <w:r>
-        <w:t>wat is referentie? Is dit centrum?</w:t>
-      </w:r>
-    </w:p>
-  </w:comment>
-  <w:comment w:id="1" w:author="Fabienne Dobbels" w:date="2026-06-03T09:45:00Z" w:initials="FD">
-    <w:p>
-      <w:r>
-        <w:annotationRef/>
-      </w:r>
-      <w:r>
-        <w:t xml:space="preserve">is dit niet iets wat bij uitleg van de studie hoort? Dit lijkt me lastig om te weten te komen bij screening op basis van dossier-analyse? Idem voor laatste exclusie criterium. ook "niet in staat zijn om instructies te volgen" lijkt me lastig en mogelijk erg subjectieve inschatting? </w:t>
-      </w:r>
-    </w:p>
-  </w:comment>
-</w:comments>
-</file>
-
-<file path=word/commentsExtended.xml><?xml version="1.0" encoding="utf-8"?>
-<w15:commentsEx xmlns:wpc="http://schemas.microsoft.com/office/word/2010/wordprocessingCanvas" xmlns:cx="http://schemas.microsoft.com/office/drawing/2014/chartex" xmlns:cx1="http://schemas.microsoft.com/office/drawing/2015/9/8/chartex" xmlns:cx2="http://schemas.microsoft.com/office/drawing/2015/10/21/chartex" xmlns:cx3="http://schemas.microsoft.com/office/drawing/2016/5/9/chartex" xmlns:cx4="http://schemas.microsoft.com/office/drawing/2016/5/10/chartex" xmlns:cx5="http://schemas.microsoft.com/office/drawing/2016/5/11/chartex" xmlns:cx6="http://schemas.microsoft.com/office/drawing/2016/5/12/chartex" xmlns:cx7="http://schemas.microsoft.com/office/drawing/2016/5/13/chartex" xmlns:cx8="http://schemas.microsoft.com/office/drawing/2016/5/14/chartex" xmlns:mc="http://schemas.openxmlformats.org/markup-compatibility/2006" xmlns:aink="http://schemas.microsoft.com/office/drawing/2016/ink" xmlns:am3d="http://schemas.microsoft.com/office/drawing/2017/model3d" xmlns:o="urn:schemas-microsoft-com:office:office" xmlns:oel="http://schemas.microsoft.com/office/2019/extlst" xmlns:r="http://schemas.openxmlformats.org/officeDocument/2006/relationships" xmlns:m="http://schemas.openxmlformats.org/officeDocument/2006/math" xmlns:v="urn:schemas-microsoft-com:vml" xmlns:wp14="http://schemas.microsoft.com/office/word/2010/wordprocessingDrawing" xmlns:wp="http://schemas.openxmlformats.org/drawingml/2006/wordprocessingDrawing" xmlns:w10="urn:schemas-microsoft-com:office:word" xmlns:w="http://schemas.openxmlformats.org/wordprocessingml/2006/main" xmlns:w14="http://schemas.microsoft.com/office/word/2010/wordml" xmlns:w15="http://schemas.microsoft.com/office/word/2012/wordml" xmlns:w16cex="http://schemas.microsoft.com/office/word/2018/wordml/cex" xmlns:w16cid="http://schemas.microsoft.com/office/word/2016/wordml/cid" xmlns:w16="http://schemas.microsoft.com/office/word/2018/wordml" xmlns:w16du="http://schemas.microsoft.com/office/word/2023/wordml/word16du" xmlns:w16sdtdh="http://schemas.microsoft.com/office/word/2020/wordml/sdtdatahash" xmlns:w16sdtfl="http://schemas.microsoft.com/office/word/2024/wordml/sdtformatlock" xmlns:w16se="http://schemas.microsoft.com/office/word/2015/wordml/symex" xmlns:wpg="http://schemas.microsoft.com/office/word/2010/wordprocessingGroup" xmlns:wpi="http://schemas.microsoft.com/office/word/2010/wordprocessingInk" xmlns:wne="http://schemas.microsoft.com/office/word/2006/wordml" xmlns:wps="http://schemas.microsoft.com/office/word/2010/wordprocessingShape" mc:Ignorable="w14 w15 w16se w16cid w16 w16cex w16sdtdh w16sdtfl w16du wp14">
-  <w15:commentEx w15:paraId="6790D9EA" w15:done="1"/>
-  <w15:commentEx w15:paraId="38F8E7D7" w15:done="1"/>
-</w15:commentsEx>
-</file>
-
-<file path=word/commentsExtensible.xml><?xml version="1.0" encoding="utf-8"?>
-<w16cex:commentsExtensible xmlns:wpc="http://schemas.microsoft.com/office/word/2010/wordprocessingCanvas" xmlns:cx="http://schemas.microsoft.com/office/drawing/2014/chartex" xmlns:cx1="http://schemas.microsoft.com/office/drawing/2015/9/8/chartex" xmlns:cx2="http://schemas.microsoft.com/office/drawing/2015/10/21/chartex" xmlns:cx3="http://schemas.microsoft.com/office/drawing/2016/5/9/chartex" xmlns:cx4="http://schemas.microsoft.com/office/drawing/2016/5/10/chartex" xmlns:cx5="http://schemas.microsoft.com/office/drawing/2016/5/11/chartex" xmlns:cx6="http://schemas.microsoft.com/office/drawing/2016/5/12/chartex" xmlns:cx7="http://schemas.microsoft.com/office/drawing/2016/5/13/chartex" xmlns:cx8="http://schemas.microsoft.com/office/drawing/2016/5/14/chartex" xmlns:cr="http://schemas.microsoft.com/office/comments/2020/reactions" xmlns:mc="http://schemas.openxmlformats.org/markup-compatibility/2006" xmlns:aink="http://schemas.microsoft.com/office/drawing/2016/ink" xmlns:am3d="http://schemas.microsoft.com/office/drawing/2017/model3d" xmlns:o="urn:schemas-microsoft-com:office:office" xmlns:oel="http://schemas.microsoft.com/office/2019/extlst" xmlns:r="http://schemas.openxmlformats.org/officeDocument/2006/relationships" xmlns:m="http://schemas.openxmlformats.org/officeDocument/2006/math" xmlns:v="urn:schemas-microsoft-com:vml" xmlns:wp14="http://schemas.microsoft.com/office/word/2010/wordprocessingDrawing" xmlns:wp="http://schemas.openxmlformats.org/drawingml/2006/wordprocessingDrawing" xmlns:w10="urn:schemas-microsoft-com:office:word" xmlns:w="http://schemas.openxmlformats.org/wordprocessingml/2006/main" xmlns:w14="http://schemas.microsoft.com/office/word/2010/wordml" xmlns:w15="http://schemas.microsoft.com/office/word/2012/wordml" xmlns:w16cex="http://schemas.microsoft.com/office/word/2018/wordml/cex" xmlns:w16cid="http://schemas.microsoft.com/office/word/2016/wordml/cid" xmlns:w16="http://schemas.microsoft.com/office/word/2018/wordml" xmlns:w16du="http://schemas.microsoft.com/office/word/2023/wordml/word16du" xmlns:w16sdtdh="http://schemas.microsoft.com/office/word/2020/wordml/sdtdatahash" xmlns:w16sdtfl="http://schemas.microsoft.com/office/word/2024/wordml/sdtformatlock" xmlns:w16se="http://schemas.microsoft.com/office/word/2015/wordml/symex" xmlns:wpg="http://schemas.microsoft.com/office/word/2010/wordprocessingGroup" xmlns:wpi="http://schemas.microsoft.com/office/word/2010/wordprocessingInk" xmlns:wne="http://schemas.microsoft.com/office/word/2006/wordml" xmlns:wps="http://schemas.microsoft.com/office/word/2010/wordprocessingShape" mc:Ignorable="w14 w15 w16se w16cid w16 w16cex w16sdtdh w16sdtfl cr w16du wp14">
-  <w16cex:commentExtensible w16cex:durableId="327E3634" w16cex:dateUtc="2026-06-03T07:45:00Z"/>
-  <w16cex:commentExtensible w16cex:durableId="4266EF4F" w16cex:dateUtc="2026-06-03T07:45:00Z"/>
-</w16cex:commentsExtensible>
-</file>
-
-<file path=word/commentsIds.xml><?xml version="1.0" encoding="utf-8"?>
-<w16cid:commentsIds xmlns:wpc="http://schemas.microsoft.com/office/word/2010/wordprocessingCanvas" xmlns:cx="http://schemas.microsoft.com/office/drawing/2014/chartex" xmlns:cx1="http://schemas.microsoft.com/office/drawing/2015/9/8/chartex" xmlns:cx2="http://schemas.microsoft.com/office/drawing/2015/10/21/chartex" xmlns:cx3="http://schemas.microsoft.com/office/drawing/2016/5/9/chartex" xmlns:cx4="http://schemas.microsoft.com/office/drawing/2016/5/10/chartex" xmlns:cx5="http://schemas.microsoft.com/office/drawing/2016/5/11/chartex" xmlns:cx6="http://schemas.microsoft.com/office/drawing/2016/5/12/chartex" xmlns:cx7="http://schemas.microsoft.com/office/drawing/2016/5/13/chartex" xmlns:cx8="http://schemas.microsoft.com/office/drawing/2016/5/14/chartex" xmlns:mc="http://schemas.openxmlformats.org/markup-compatibility/2006" xmlns:aink="http://schemas.microsoft.com/office/drawing/2016/ink" xmlns:am3d="http://schemas.microsoft.com/office/drawing/2017/model3d" xmlns:o="urn:schemas-microsoft-com:office:office" xmlns:oel="http://schemas.microsoft.com/office/2019/extlst" xmlns:r="http://schemas.openxmlformats.org/officeDocument/2006/relationships" xmlns:m="http://schemas.openxmlformats.org/officeDocument/2006/math" xmlns:v="urn:schemas-microsoft-com:vml" xmlns:wp14="http://schemas.microsoft.com/office/word/2010/wordprocessingDrawing" xmlns:wp="http://schemas.openxmlformats.org/drawingml/2006/wordprocessingDrawing" xmlns:w10="urn:schemas-microsoft-com:office:word" xmlns:w="http://schemas.openxmlformats.org/wordprocessingml/2006/main" xmlns:w14="http://schemas.microsoft.com/office/word/2010/wordml" xmlns:w15="http://schemas.microsoft.com/office/word/2012/wordml" xmlns:w16cex="http://schemas.microsoft.com/office/word/2018/wordml/cex" xmlns:w16cid="http://schemas.microsoft.com/office/word/2016/wordml/cid" xmlns:w16="http://schemas.microsoft.com/office/word/2018/wordml" xmlns:w16du="http://schemas.microsoft.com/office/word/2023/wordml/word16du" xmlns:w16sdtdh="http://schemas.microsoft.com/office/word/2020/wordml/sdtdatahash" xmlns:w16sdtfl="http://schemas.microsoft.com/office/word/2024/wordml/sdtformatlock" xmlns:w16se="http://schemas.microsoft.com/office/word/2015/wordml/symex" xmlns:wpg="http://schemas.microsoft.com/office/word/2010/wordprocessingGroup" xmlns:wpi="http://schemas.microsoft.com/office/word/2010/wordprocessingInk" xmlns:wne="http://schemas.microsoft.com/office/word/2006/wordml" xmlns:wps="http://schemas.microsoft.com/office/word/2010/wordprocessingShape" mc:Ignorable="w14 w15 w16se w16cid w16 w16cex w16sdtdh w16sdtfl w16du wp14">
-  <w16cid:commentId w16cid:paraId="6790D9EA" w16cid:durableId="327E3634"/>
-  <w16cid:commentId w16cid:paraId="38F8E7D7" w16cid:durableId="4266EF4F"/>
-</w16cid:commentsIds>
-</file>
-
 <file path=word/endnotes.xml><?xml version="1.0" encoding="utf-8"?>
 <w:endnotes xmlns:wpc="http://schemas.microsoft.com/office/word/2010/wordprocessingCanvas" xmlns:cx="http://schemas.microsoft.com/office/drawing/2014/chartex" xmlns:cx1="http://schemas.microsoft.com/office/drawing/2015/9/8/chartex" xmlns:cx2="http://schemas.microsoft.com/office/drawing/2015/10/21/chartex" xmlns:cx3="http://schemas.microsoft.com/office/drawing/2016/5/9/chartex" xmlns:cx4="http://schemas.microsoft.com/office/drawing/2016/5/10/chartex" xmlns:cx5="http://schemas.microsoft.com/office/drawing/2016/5/11/chartex" xmlns:cx6="http://schemas.microsoft.com/office/drawing/2016/5/12/chartex" xmlns:cx7="http://schemas.microsoft.com/office/drawing/2016/5/13/chartex" xmlns:cx8="http://schemas.microsoft.com/office/drawing/2016/5/14/chartex" xmlns:mc="http://schemas.openxmlformats.org/markup-compatibility/2006" xmlns:aink="http://schemas.microsoft.com/office/drawing/2016/ink" xmlns:am3d="http://schemas.microsoft.com/office/drawing/2017/model3d" xmlns:o="urn:schemas-microsoft-com:office:office" xmlns:oel="http://schemas.microsoft.com/office/2019/extlst" xmlns:r="http://schemas.openxmlformats.org/officeDocument/2006/relationships" xmlns:m="http://schemas.openxmlformats.org/officeDocument/2006/math" xmlns:v="urn:schemas-microsoft-com:vml" xmlns:wp14="http://schemas.microsoft.com/office/word/2010/wordprocessingDrawing" xmlns:wp="http://schemas.openxmlformats.org/drawingml/2006/wordprocessingDrawing" xmlns:w10="urn:schemas-microsoft-com:office:word" xmlns:w="http://schemas.openxmlformats.org/wordprocessingml/2006/main" xmlns:w14="http://schemas.microsoft.com/office/word/2010/wordml" xmlns:w15="http://schemas.microsoft.com/office/word/2012/wordml" xmlns:w16cex="http://schemas.microsoft.com/office/word/2018/wordml/cex" xmlns:w16cid="http://schemas.microsoft.com/office/word/2016/wordml/cid" xmlns:w16="http://schemas.microsoft.com/office/word/2018/wordml" xmlns:w16du="http://schemas.microsoft.com/office/word/2023/wordml/word16du" xmlns:w16sdtdh="http://schemas.microsoft.com/office/word/2020/wordml/sdtdatahash" xmlns:w16sdtfl="http://schemas.microsoft.com/office/word/2024/wordml/sdtformatlock" xmlns:w16se="http://schemas.microsoft.com/office/word/2015/wordml/symex" xmlns:wpg="http://schemas.microsoft.com/office/word/2010/wordprocessingGroup" xmlns:wpi="http://schemas.microsoft.com/office/word/2010/wordprocessingInk" xmlns:wne="http://schemas.microsoft.com/office/word/2006/wordml" xmlns:wps="http://schemas.microsoft.com/office/word/2010/wordprocessingShape" mc:Ignorable="w14 w15 w16se w16cid w16 w16cex w16sdtdh w16sdtfl w16du wp14">
   <w:endnote w:type="separator" w:id="-1">
@@ -1138,9 +1065,6 @@
       <w:pPr>
         <w:spacing w:after="0" w:line="240" w:lineRule="auto"/>
       </w:pPr>
-      <w:r>
-        <w:separator/>
-      </w:r>
     </w:p>
   </w:endnote>
   <w:endnote w:type="continuationSeparator" w:id="0">
@@ -1148,9 +1072,6 @@
       <w:pPr>
         <w:spacing w:after="0" w:line="240" w:lineRule="auto"/>
       </w:pPr>
-      <w:r>
-        <w:continuationSeparator/>
-      </w:r>
     </w:p>
   </w:endnote>
 </w:endnotes>
@@ -1239,10 +1160,119 @@
   <w:p>
     <w:pPr>
       <w:pStyle w:val="Voettekst"/>
+      <w:jc w:val="center"/>
       <w:rPr>
         <w:rFonts w:ascii="Calibri" w:hAnsi="Calibri" w:cs="Calibri"/>
       </w:rPr>
     </w:pPr>
+    <w:r>
+      <w:rPr>
+        <w:rFonts w:ascii="Arial" w:hAnsi="Arial" w:eastAsia="Arial" w:cs="Arial"/>
+        <w:b w:val="0"/>
+        <w:color w:val="59636E"/>
+        <w:sz w:val="18"/>
+      </w:rPr>
+      <w:t xml:space="preserve">Pagina </w:t>
+    </w:r>
+    <w:r>
+      <w:rPr>
+        <w:rFonts w:ascii="Arial" w:hAnsi="Arial" w:eastAsia="Arial" w:cs="Arial"/>
+        <w:b w:val="0"/>
+        <w:color w:val="59636E"/>
+        <w:sz w:val="18"/>
+      </w:rPr>
+      <w:fldChar w:fldCharType="begin"/>
+    </w:r>
+    <w:r>
+      <w:rPr>
+        <w:rFonts w:ascii="Arial" w:hAnsi="Arial" w:eastAsia="Arial" w:cs="Arial"/>
+        <w:b w:val="0"/>
+        <w:color w:val="59636E"/>
+        <w:sz w:val="18"/>
+      </w:rPr>
+      <w:instrText xml:space="preserve"> PAGE </w:instrText>
+    </w:r>
+    <w:r>
+      <w:rPr>
+        <w:rFonts w:ascii="Arial" w:hAnsi="Arial" w:eastAsia="Arial" w:cs="Arial"/>
+        <w:b w:val="0"/>
+        <w:color w:val="59636E"/>
+        <w:sz w:val="18"/>
+      </w:rPr>
+      <w:fldChar w:fldCharType="separate"/>
+    </w:r>
+    <w:r>
+      <w:rPr>
+        <w:rFonts w:ascii="Arial" w:hAnsi="Arial" w:eastAsia="Arial" w:cs="Arial"/>
+        <w:b w:val="0"/>
+        <w:color w:val="59636E"/>
+        <w:sz w:val="18"/>
+      </w:rPr>
+      <w:t>1</w:t>
+    </w:r>
+    <w:r>
+      <w:rPr>
+        <w:rFonts w:ascii="Arial" w:hAnsi="Arial" w:eastAsia="Arial" w:cs="Arial"/>
+        <w:b w:val="0"/>
+        <w:color w:val="59636E"/>
+        <w:sz w:val="18"/>
+      </w:rPr>
+      <w:fldChar w:fldCharType="end"/>
+    </w:r>
+    <w:r>
+      <w:rPr>
+        <w:rFonts w:ascii="Arial" w:hAnsi="Arial" w:eastAsia="Arial" w:cs="Arial"/>
+        <w:b w:val="0"/>
+        <w:color w:val="59636E"/>
+        <w:sz w:val="18"/>
+      </w:rPr>
+      <w:t xml:space="preserve"> van </w:t>
+    </w:r>
+    <w:r>
+      <w:rPr>
+        <w:rFonts w:ascii="Arial" w:hAnsi="Arial" w:eastAsia="Arial" w:cs="Arial"/>
+        <w:b w:val="0"/>
+        <w:color w:val="59636E"/>
+        <w:sz w:val="18"/>
+      </w:rPr>
+      <w:fldChar w:fldCharType="begin"/>
+    </w:r>
+    <w:r>
+      <w:rPr>
+        <w:rFonts w:ascii="Arial" w:hAnsi="Arial" w:eastAsia="Arial" w:cs="Arial"/>
+        <w:b w:val="0"/>
+        <w:color w:val="59636E"/>
+        <w:sz w:val="18"/>
+      </w:rPr>
+      <w:instrText xml:space="preserve"> NUMPAGES </w:instrText>
+    </w:r>
+    <w:r>
+      <w:rPr>
+        <w:rFonts w:ascii="Arial" w:hAnsi="Arial" w:eastAsia="Arial" w:cs="Arial"/>
+        <w:b w:val="0"/>
+        <w:color w:val="59636E"/>
+        <w:sz w:val="18"/>
+      </w:rPr>
+      <w:fldChar w:fldCharType="separate"/>
+    </w:r>
+    <w:r>
+      <w:rPr>
+        <w:rFonts w:ascii="Arial" w:hAnsi="Arial" w:eastAsia="Arial" w:cs="Arial"/>
+        <w:b w:val="0"/>
+        <w:color w:val="59636E"/>
+        <w:sz w:val="18"/>
+      </w:rPr>
+      <w:t>1</w:t>
+    </w:r>
+    <w:r>
+      <w:rPr>
+        <w:rFonts w:ascii="Arial" w:hAnsi="Arial" w:eastAsia="Arial" w:cs="Arial"/>
+        <w:b w:val="0"/>
+        <w:color w:val="59636E"/>
+        <w:sz w:val="18"/>
+      </w:rPr>
+      <w:fldChar w:fldCharType="end"/>
+    </w:r>
   </w:p>
 </w:ftr>
 </file>
@@ -1254,9 +1284,6 @@
       <w:pPr>
         <w:spacing w:after="0" w:line="240" w:lineRule="auto"/>
       </w:pPr>
-      <w:r>
-        <w:separator/>
-      </w:r>
     </w:p>
   </w:footnote>
   <w:footnote w:type="continuationSeparator" w:id="0">
@@ -1264,9 +1291,6 @@
       <w:pPr>
         <w:spacing w:after="0" w:line="240" w:lineRule="auto"/>
       </w:pPr>
-      <w:r>
-        <w:continuationSeparator/>
-      </w:r>
     </w:p>
   </w:footnote>
 </w:footnotes>
@@ -1277,6 +1301,7 @@
   <w:p>
     <w:pPr>
       <w:pStyle w:val="Koptekst"/>
+      <w:jc w:val="left"/>
       <w:rPr>
         <w:color w:val="000000" w:themeColor="text1"/>
         <w:sz w:val="18"/>
@@ -1287,26 +1312,12 @@
     <w:r>
       <w:rPr>
         <w:rFonts w:ascii="Arial" w:hAnsi="Arial" w:cs="Arial" w:eastAsia="Arial"/>
-        <w:color w:val="000000" w:themeColor="text1"/>
+        <w:b w:val="0"/>
+        <w:color w:val="59636E"/>
+        <w:sz w:val="18"/>
         <w:lang w:val="en-GB"/>
       </w:rPr>
-      <w:t>Screening-before-consent form</w:t>
-    </w:r>
-    <w:r>
-      <w:rPr>
-        <w:rFonts w:ascii="Arial" w:hAnsi="Arial" w:cs="Arial" w:eastAsia="Arial"/>
-        <w:color w:val="000000" w:themeColor="text1"/>
-        <w:lang w:val="en-GB"/>
-      </w:rPr>
-      <w:tab/>
-    </w:r>
-    <w:r>
-      <w:rPr>
-        <w:rFonts w:ascii="Arial" w:hAnsi="Arial" w:cs="Arial" w:eastAsia="Arial"/>
-        <w:color w:val="000000" w:themeColor="text1"/>
-        <w:lang w:val="en-GB"/>
-      </w:rPr>
-      <w:tab/>
+      <w:t>PARADISE (S71769) — eCRF 01: Screening voor toestemming</w:t>
     </w:r>
   </w:p>
 </w:hdr>

</xml_diff>

<commit_message>
eCRF-documenten: opmaak volledig uniform (Arial + header/footer met logo-afbeeldingen uit Voetzorgfolder-template), footer toont per document de eigen naam; Excel-patientenlijst gesynchroniseerd tussen beide mapstructuren
</commit_message>
<xml_diff>
--- a/(e)CRF/Per nummer/01_Screening voor toestemming.docx
+++ b/(e)CRF/Per nummer/01_Screening voor toestemming.docx
@@ -1,6 +1,6 @@
 
 <file path=word/document.xml><?xml version="1.0" encoding="utf-8"?>
-<w:document xmlns:wpc="http://schemas.microsoft.com/office/word/2010/wordprocessingCanvas" xmlns:cx="http://schemas.microsoft.com/office/drawing/2014/chartex" xmlns:cx1="http://schemas.microsoft.com/office/drawing/2015/9/8/chartex" xmlns:cx2="http://schemas.microsoft.com/office/drawing/2015/10/21/chartex" xmlns:cx3="http://schemas.microsoft.com/office/drawing/2016/5/9/chartex" xmlns:cx4="http://schemas.microsoft.com/office/drawing/2016/5/10/chartex" xmlns:cx5="http://schemas.microsoft.com/office/drawing/2016/5/11/chartex" xmlns:cx6="http://schemas.microsoft.com/office/drawing/2016/5/12/chartex" xmlns:cx7="http://schemas.microsoft.com/office/drawing/2016/5/13/chartex" xmlns:cx8="http://schemas.microsoft.com/office/drawing/2016/5/14/chartex" xmlns:mc="http://schemas.openxmlformats.org/markup-compatibility/2006" xmlns:aink="http://schemas.microsoft.com/office/drawing/2016/ink" xmlns:am3d="http://schemas.microsoft.com/office/drawing/2017/model3d" xmlns:o="urn:schemas-microsoft-com:office:office" xmlns:oel="http://schemas.microsoft.com/office/2019/extlst" xmlns:r="http://schemas.openxmlformats.org/officeDocument/2006/relationships" xmlns:m="http://schemas.openxmlformats.org/officeDocument/2006/math" xmlns:v="urn:schemas-microsoft-com:vml" xmlns:wp14="http://schemas.microsoft.com/office/word/2010/wordprocessingDrawing" xmlns:wp="http://schemas.openxmlformats.org/drawingml/2006/wordprocessingDrawing" xmlns:w10="urn:schemas-microsoft-com:office:word" xmlns:w="http://schemas.openxmlformats.org/wordprocessingml/2006/main" xmlns:w14="http://schemas.microsoft.com/office/word/2010/wordml" xmlns:w15="http://schemas.microsoft.com/office/word/2012/wordml" xmlns:w16cex="http://schemas.microsoft.com/office/word/2018/wordml/cex" xmlns:w16cid="http://schemas.microsoft.com/office/word/2016/wordml/cid" xmlns:w16="http://schemas.microsoft.com/office/word/2018/wordml" xmlns:w16du="http://schemas.microsoft.com/office/word/2023/wordml/word16du" xmlns:w16sdtdh="http://schemas.microsoft.com/office/word/2020/wordml/sdtdatahash" xmlns:w16sdtfl="http://schemas.microsoft.com/office/word/2024/wordml/sdtformatlock" xmlns:w16se="http://schemas.microsoft.com/office/word/2015/wordml/symex" xmlns:wpg="http://schemas.microsoft.com/office/word/2010/wordprocessingGroup" xmlns:wpi="http://schemas.microsoft.com/office/word/2010/wordprocessingInk" xmlns:wne="http://schemas.microsoft.com/office/word/2006/wordml" xmlns:wps="http://schemas.microsoft.com/office/word/2010/wordprocessingShape" mc:Ignorable="w14 w15 w16se w16cid w16 w16cex w16sdtdh w16sdtfl w16du wp14">
+<w:document xmlns:wpc="http://schemas.microsoft.com/office/word/2010/wordprocessingCanvas" xmlns:cx="http://schemas.microsoft.com/office/drawing/2014/chartex" xmlns:cx1="http://schemas.microsoft.com/office/drawing/2015/9/8/chartex" xmlns:cx2="http://schemas.microsoft.com/office/drawing/2015/10/21/chartex" xmlns:cx3="http://schemas.microsoft.com/office/drawing/2016/5/9/chartex" xmlns:cx4="http://schemas.microsoft.com/office/drawing/2016/5/10/chartex" xmlns:cx5="http://schemas.microsoft.com/office/drawing/2016/5/11/chartex" xmlns:cx6="http://schemas.microsoft.com/office/drawing/2016/5/12/chartex" xmlns:cx7="http://schemas.microsoft.com/office/drawing/2016/5/13/chartex" xmlns:cx8="http://schemas.microsoft.com/office/drawing/2016/5/14/chartex" xmlns:mc="http://schemas.openxmlformats.org/markup-compatibility/2006" xmlns:aink="http://schemas.microsoft.com/office/drawing/2016/ink" xmlns:am3d="http://schemas.microsoft.com/office/drawing/2017/model3d" xmlns:o="urn:schemas-microsoft-com:office:office" xmlns:oel="http://schemas.microsoft.com/office/2019/extlst" xmlns:r="http://schemas.openxmlformats.org/officeDocument/2006/relationships" xmlns:m="http://schemas.openxmlformats.org/officeDocument/2006/math" xmlns:v="urn:schemas-microsoft-com:vml" xmlns:wp14="http://schemas.microsoft.com/office/word/2010/wordprocessingDrawing" xmlns:wp="http://schemas.openxmlformats.org/drawingml/2006/wordprocessingDrawing" xmlns:w10="urn:schemas-microsoft-com:office:word" xmlns:w="http://schemas.openxmlformats.org/wordprocessingml/2006/main" xmlns:w14="http://schemas.microsoft.com/office/word/2010/wordml" xmlns:w15="http://schemas.microsoft.com/office/word/2012/wordml" xmlns:w16cei="http://schemas.microsoft.com/office/word/2026/wordml/cei" xmlns:w16cex="http://schemas.microsoft.com/office/word/2018/wordml/cex" xmlns:w16cid="http://schemas.microsoft.com/office/word/2016/wordml/cid" xmlns:w16="http://schemas.microsoft.com/office/word/2018/wordml" xmlns:w16du="http://schemas.microsoft.com/office/word/2023/wordml/word16du" xmlns:w16sdtdh="http://schemas.microsoft.com/office/word/2020/wordml/sdtdatahash" xmlns:w16sdtfl="http://schemas.microsoft.com/office/word/2024/wordml/sdtformatlock" xmlns:w16se="http://schemas.microsoft.com/office/word/2015/wordml/symex" xmlns:wpg="http://schemas.microsoft.com/office/word/2010/wordprocessingGroup" xmlns:wpi="http://schemas.microsoft.com/office/word/2010/wordprocessingInk" xmlns:wne="http://schemas.microsoft.com/office/word/2006/wordml" xmlns:wps="http://schemas.microsoft.com/office/word/2010/wordprocessingShape" mc:Ignorable="w14 w15 w16se w16cid w16 w16cex w16sdtdh w16sdtfl w16du wp14">
   <w:body>
     <w:p>
       <w:pPr>
@@ -18,7 +18,6 @@
       </w:pPr>
       <w:r>
         <w:rPr>
-          <w:rFonts w:ascii="Arial" w:hAnsi="Arial" w:cs="Arial" w:eastAsia="Arial"/>
           <w:b/>
           <w:bCs/>
           <w:color w:val="123A5F"/>
@@ -45,9 +44,9 @@
           <w:lang w:val="en-GB"/>
         </w:rPr>
       </w:pPr>
+      <w:proofErr w:type="spellStart"/>
       <w:r>
         <w:rPr>
-          <w:rFonts w:ascii="Arial" w:hAnsi="Arial" w:cs="Arial" w:eastAsia="Arial"/>
           <w:b/>
           <w:bCs/>
           <w:color w:val="123A5F"/>
@@ -57,9 +56,9 @@
         </w:rPr>
         <w:t>Referentie</w:t>
       </w:r>
+      <w:proofErr w:type="spellEnd"/>
       <w:r>
         <w:rPr>
-          <w:rFonts w:ascii="Arial" w:hAnsi="Arial" w:cs="Arial" w:eastAsia="Arial"/>
           <w:b/>
           <w:bCs/>
           <w:color w:val="123A5F"/>
@@ -71,7 +70,6 @@
       </w:r>
       <w:r>
         <w:rPr>
-          <w:rFonts w:ascii="Arial" w:hAnsi="Arial" w:cs="Arial" w:eastAsia="Arial"/>
           <w:b/>
           <w:bCs/>
           <w:color w:val="123A5F"/>
@@ -79,23 +77,10 @@
           <w:szCs w:val="24"/>
           <w:lang w:val="en-GB"/>
         </w:rPr>
-        <w:t>:</w:t>
+        <w:t xml:space="preserve">: </w:t>
       </w:r>
       <w:r>
         <w:rPr>
-          <w:rFonts w:ascii="Arial" w:hAnsi="Arial" w:cs="Arial" w:eastAsia="Arial"/>
-          <w:b/>
-          <w:bCs/>
-          <w:color w:val="123A5F"/>
-          <w:sz w:val="24"/>
-          <w:szCs w:val="24"/>
-          <w:lang w:val="en-GB"/>
-        </w:rPr>
-        <w:t xml:space="preserve"> </w:t>
-      </w:r>
-      <w:r>
-        <w:rPr>
-          <w:rFonts w:ascii="Arial" w:hAnsi="Arial" w:eastAsia="Arial" w:cs="Arial"/>
           <w:color w:val="24303B"/>
           <w:lang w:val="en-GB"/>
         </w:rPr>
@@ -119,7 +104,6 @@
       </w:pPr>
       <w:r>
         <w:rPr>
-          <w:rFonts w:ascii="Arial" w:hAnsi="Arial" w:cs="Arial" w:eastAsia="Arial"/>
           <w:b/>
           <w:bCs/>
           <w:color w:val="123A5F"/>
@@ -130,7 +114,6 @@
       </w:r>
       <w:r>
         <w:rPr>
-          <w:rFonts w:ascii="Arial" w:hAnsi="Arial" w:cs="Arial" w:eastAsia="Arial"/>
           <w:b/>
           <w:bCs/>
           <w:color w:val="123A5F"/>
@@ -141,7 +124,6 @@
       </w:r>
       <w:r>
         <w:rPr>
-          <w:rFonts w:ascii="Arial" w:hAnsi="Arial" w:cs="Arial" w:eastAsia="Arial"/>
           <w:b/>
           <w:bCs/>
           <w:color w:val="123A5F"/>
@@ -152,7 +134,6 @@
       </w:r>
       <w:r>
         <w:rPr>
-          <w:rFonts w:ascii="Arial" w:hAnsi="Arial" w:cs="Arial" w:eastAsia="Arial"/>
           <w:color w:val="24303B"/>
           <w:sz w:val="24"/>
           <w:szCs w:val="24"/>
@@ -177,7 +158,6 @@
       </w:pPr>
       <w:r>
         <w:rPr>
-          <w:rFonts w:ascii="Arial" w:hAnsi="Arial" w:cs="Arial" w:eastAsia="Arial"/>
           <w:b/>
           <w:bCs/>
           <w:color w:val="123A5F"/>
@@ -188,7 +168,6 @@
       </w:r>
       <w:r>
         <w:rPr>
-          <w:rFonts w:ascii="Arial" w:hAnsi="Arial" w:cs="Arial" w:eastAsia="Arial"/>
           <w:b/>
           <w:bCs/>
           <w:color w:val="123A5F"/>
@@ -199,7 +178,6 @@
       </w:r>
       <w:r>
         <w:rPr>
-          <w:rFonts w:ascii="Arial" w:hAnsi="Arial" w:cs="Arial" w:eastAsia="Arial"/>
           <w:color w:val="24303B"/>
           <w:sz w:val="24"/>
           <w:szCs w:val="24"/>
@@ -234,7 +212,6 @@
       </w:pPr>
       <w:r>
         <w:rPr>
-          <w:rFonts w:ascii="Arial" w:hAnsi="Arial" w:cs="Arial" w:eastAsia="Arial"/>
           <w:b/>
           <w:bCs/>
           <w:color w:val="123A5F"/>
@@ -255,7 +232,6 @@
       </w:pPr>
       <w:r>
         <w:rPr>
-          <w:rFonts w:ascii="Arial" w:hAnsi="Arial" w:cs="Arial" w:eastAsia="Arial"/>
           <w:b/>
           <w:color w:val="123A5F"/>
         </w:rPr>
@@ -272,7 +248,6 @@
       </w:pPr>
       <w:r>
         <w:rPr>
-          <w:rFonts w:ascii="Arial" w:hAnsi="Arial" w:cs="Arial" w:eastAsia="Arial"/>
           <w:color w:val="24303B"/>
         </w:rPr>
         <w:t>Patiënten met diabetes worden gerekruteerd volgens de volgende criteria:</w:t>
@@ -330,14 +305,12 @@
             </w:pPr>
             <w:r>
               <w:rPr>
-                <w:rFonts w:ascii="Arial" w:hAnsi="Arial" w:cs="Arial" w:eastAsia="Arial"/>
                 <w:color w:val="24303B"/>
               </w:rPr>
               <w:t>Volwassen Nederlandstalige patiënten (of patiënten die Nederlands begrijpen) ≥ 18 jaar</w:t>
             </w:r>
             <w:r>
               <w:rPr>
-                <w:rFonts w:ascii="Arial" w:hAnsi="Arial" w:cs="Arial" w:eastAsia="Arial"/>
                 <w:color w:val="24303B"/>
               </w:rPr>
               <w:t>.</w:t>
@@ -379,14 +352,12 @@
             </w:pPr>
             <w:r>
               <w:rPr>
-                <w:rFonts w:ascii="Arial" w:hAnsi="Arial" w:cs="Arial" w:eastAsia="Arial"/>
                 <w:color w:val="24303B"/>
               </w:rPr>
               <w:t>Diabetes mellitus type 1 of 2</w:t>
             </w:r>
             <w:r>
               <w:rPr>
-                <w:rFonts w:ascii="Arial" w:hAnsi="Arial" w:cs="Arial" w:eastAsia="Arial"/>
                 <w:color w:val="24303B"/>
               </w:rPr>
               <w:t>.</w:t>
@@ -428,56 +399,104 @@
             </w:pPr>
             <w:r>
               <w:rPr>
-                <w:rFonts w:ascii="Arial" w:hAnsi="Arial" w:cs="Arial" w:eastAsia="Arial"/>
-                <w:color w:val="24303B"/>
-              </w:rPr>
-              <w:t>Risicovoet (categorie 3) met een recent genezen plantair voet</w:t>
-            </w:r>
-            <w:r>
-              <w:rPr>
-                <w:rFonts w:ascii="Arial" w:hAnsi="Arial" w:cs="Arial" w:eastAsia="Arial"/>
+                <w:color w:val="24303B"/>
+              </w:rPr>
+              <w:t xml:space="preserve">Risicovoet (categorie 3) met een recent genezen </w:t>
+            </w:r>
+            <w:proofErr w:type="spellStart"/>
+            <w:r>
+              <w:rPr>
+                <w:color w:val="24303B"/>
+              </w:rPr>
+              <w:t>plantair</w:t>
+            </w:r>
+            <w:proofErr w:type="spellEnd"/>
+            <w:r>
+              <w:rPr>
+                <w:color w:val="24303B"/>
+              </w:rPr>
+              <w:t xml:space="preserve"> voet</w:t>
+            </w:r>
+            <w:r>
+              <w:rPr>
                 <w:color w:val="24303B"/>
               </w:rPr>
               <w:t>ulcus</w:t>
             </w:r>
             <w:r>
               <w:rPr>
-                <w:rFonts w:ascii="Arial" w:hAnsi="Arial" w:cs="Arial" w:eastAsia="Arial"/>
-                <w:color w:val="24303B"/>
-              </w:rPr>
-              <w:t xml:space="preserve"> of een partiële voetamputatie (één of meerdere tenen, inclusief hallux) of resectie van één of meerdere metatars</w:t>
-            </w:r>
-            <w:r>
-              <w:rPr>
-                <w:rFonts w:ascii="Arial" w:hAnsi="Arial" w:cs="Arial" w:eastAsia="Arial"/>
+                <w:color w:val="24303B"/>
+              </w:rPr>
+              <w:t xml:space="preserve"> of een partiële voetamputatie (één of meerdere tenen, inclusief </w:t>
+            </w:r>
+            <w:proofErr w:type="spellStart"/>
+            <w:r>
+              <w:rPr>
+                <w:color w:val="24303B"/>
+              </w:rPr>
+              <w:t>hallux</w:t>
+            </w:r>
+            <w:proofErr w:type="spellEnd"/>
+            <w:r>
+              <w:rPr>
+                <w:color w:val="24303B"/>
+              </w:rPr>
+              <w:t xml:space="preserve">) of resectie van één of meerdere </w:t>
+            </w:r>
+            <w:proofErr w:type="spellStart"/>
+            <w:r>
+              <w:rPr>
+                <w:color w:val="24303B"/>
+              </w:rPr>
+              <w:t>metatars</w:t>
+            </w:r>
+            <w:r>
+              <w:rPr>
                 <w:color w:val="24303B"/>
               </w:rPr>
               <w:t>aal</w:t>
             </w:r>
             <w:r>
               <w:rPr>
-                <w:rFonts w:ascii="Arial" w:hAnsi="Arial" w:cs="Arial" w:eastAsia="Arial"/>
-                <w:color w:val="24303B"/>
-              </w:rPr>
-              <w:t>koppen (niet de eerste metatars</w:t>
-            </w:r>
-            <w:r>
-              <w:rPr>
-                <w:rFonts w:ascii="Arial" w:hAnsi="Arial" w:cs="Arial" w:eastAsia="Arial"/>
+                <w:color w:val="24303B"/>
+              </w:rPr>
+              <w:t>koppen</w:t>
+            </w:r>
+            <w:proofErr w:type="spellEnd"/>
+            <w:r>
+              <w:rPr>
+                <w:color w:val="24303B"/>
+              </w:rPr>
+              <w:t xml:space="preserve"> (niet de eerste </w:t>
+            </w:r>
+            <w:proofErr w:type="spellStart"/>
+            <w:r>
+              <w:rPr>
+                <w:color w:val="24303B"/>
+              </w:rPr>
+              <w:t>metatars</w:t>
+            </w:r>
+            <w:r>
+              <w:rPr>
                 <w:color w:val="24303B"/>
               </w:rPr>
               <w:t>a</w:t>
             </w:r>
             <w:r>
               <w:rPr>
-                <w:rFonts w:ascii="Arial" w:hAnsi="Arial" w:cs="Arial" w:eastAsia="Arial"/>
-                <w:color w:val="24303B"/>
-              </w:rPr>
-              <w:t>alkop) in de afgelopen 18 maanden tot 2 weken vóór inclusie</w:t>
-            </w:r>
-            <w:r>
-              <w:rPr>
-                <w:rFonts w:ascii="Arial" w:hAnsi="Arial" w:cs="Arial" w:eastAsia="Arial"/>
+                <w:color w:val="24303B"/>
+              </w:rPr>
+              <w:t>alkop</w:t>
+            </w:r>
+            <w:proofErr w:type="spellEnd"/>
+            <w:r>
+              <w:rPr>
+                <w:color w:val="24303B"/>
+              </w:rPr>
+              <w:t>) in de afgelopen 18 maanden tot 2 weken vóór inclusie</w:t>
+            </w:r>
+            <w:r>
+              <w:rPr>
                 <w:color w:val="24303B"/>
               </w:rPr>
               <w:t>.</w:t>
@@ -519,14 +538,12 @@
             </w:pPr>
             <w:r>
               <w:rPr>
-                <w:rFonts w:ascii="Arial" w:hAnsi="Arial" w:cs="Arial" w:eastAsia="Arial"/>
                 <w:color w:val="24303B"/>
               </w:rPr>
               <w:t>In staat om zelfstandig en zonder hulpmiddelen op blote voeten te stappen</w:t>
             </w:r>
             <w:r>
               <w:rPr>
-                <w:rFonts w:ascii="Arial" w:hAnsi="Arial" w:cs="Arial" w:eastAsia="Arial"/>
                 <w:color w:val="24303B"/>
               </w:rPr>
               <w:t>.</w:t>
@@ -568,10 +585,37 @@
             </w:pPr>
             <w:r>
               <w:rPr>
-                <w:rFonts w:ascii="Arial" w:hAnsi="Arial" w:cs="Arial" w:eastAsia="Arial"/>
-                <w:color w:val="24303B"/>
-              </w:rPr>
-              <w:t>Beschikt over beschermend schoeisel dat volledig op maat gemaakt is (‘orthopedisch schoeisel’) of bestaat uit op maat gemaakte voetzolen gedragen in semi-orthopedisch schoeisel of adequate confectieschoenen met extra diepte. Indien de patiënt nog niet over dergelijk schoeisel beschikt, moet hij/zij bereid zijn om over te schakelen naar dergelijk beschermend schoeisel (reeds terugbetaald door het RIZIV-INAMI).</w:t>
+                <w:color w:val="24303B"/>
+              </w:rPr>
+              <w:t xml:space="preserve">Beschikt over beschermend schoeisel dat volledig op maat gemaakt is (‘orthopedisch schoeisel’) of bestaat uit op maat gemaakte voetzolen gedragen in semi-orthopedisch schoeisel of adequate confectieschoenen met extra diepte. </w:t>
+            </w:r>
+            <w:proofErr w:type="gramStart"/>
+            <w:r>
+              <w:rPr>
+                <w:color w:val="24303B"/>
+              </w:rPr>
+              <w:t>Indien</w:t>
+            </w:r>
+            <w:proofErr w:type="gramEnd"/>
+            <w:r>
+              <w:rPr>
+                <w:color w:val="24303B"/>
+              </w:rPr>
+              <w:t xml:space="preserve"> de patiënt nog niet over dergelijk schoeisel beschikt, moet hij/zij bereid zijn om over te schakelen naar dergelijk beschermend schoeisel (</w:t>
+            </w:r>
+            <w:proofErr w:type="gramStart"/>
+            <w:r>
+              <w:rPr>
+                <w:color w:val="24303B"/>
+              </w:rPr>
+              <w:t>reeds</w:t>
+            </w:r>
+            <w:proofErr w:type="gramEnd"/>
+            <w:r>
+              <w:rPr>
+                <w:color w:val="24303B"/>
+              </w:rPr>
+              <w:t xml:space="preserve"> terugbetaald door het RIZIV-INAMI).</w:t>
             </w:r>
           </w:p>
         </w:tc>
@@ -607,7 +651,6 @@
       </w:pPr>
       <w:r>
         <w:rPr>
-          <w:rFonts w:ascii="Arial" w:hAnsi="Arial" w:cs="Arial" w:eastAsia="Arial"/>
           <w:b/>
           <w:bCs/>
           <w:color w:val="123A5F"/>
@@ -625,10 +668,23 @@
       </w:pPr>
       <w:r>
         <w:rPr>
-          <w:rFonts w:ascii="Arial" w:hAnsi="Arial" w:cs="Arial" w:eastAsia="Arial"/>
           <w:color w:val="24303B"/>
         </w:rPr>
-        <w:t>Patiënten met diabetes worden uitgesloten indien zij:</w:t>
+        <w:t xml:space="preserve">Patiënten met diabetes worden uitgesloten </w:t>
+      </w:r>
+      <w:proofErr w:type="gramStart"/>
+      <w:r>
+        <w:rPr>
+          <w:color w:val="24303B"/>
+        </w:rPr>
+        <w:t>indien</w:t>
+      </w:r>
+      <w:proofErr w:type="gramEnd"/>
+      <w:r>
+        <w:rPr>
+          <w:color w:val="24303B"/>
+        </w:rPr>
+        <w:t xml:space="preserve"> zij:</w:t>
       </w:r>
     </w:p>
     <w:tbl>
@@ -683,10 +739,23 @@
             </w:pPr>
             <w:r>
               <w:rPr>
-                <w:rFonts w:ascii="Arial" w:hAnsi="Arial" w:cs="Arial" w:eastAsia="Arial"/>
-                <w:color w:val="24303B"/>
-              </w:rPr>
-              <w:t>Een amputatie hebben ondergaan proximaal van de metatarsofalangeale gewrichten</w:t>
+                <w:color w:val="24303B"/>
+              </w:rPr>
+              <w:t xml:space="preserve">Een amputatie hebben ondergaan proximaal van de </w:t>
+            </w:r>
+            <w:proofErr w:type="spellStart"/>
+            <w:r>
+              <w:rPr>
+                <w:color w:val="24303B"/>
+              </w:rPr>
+              <w:t>metatarsofalangeale</w:t>
+            </w:r>
+            <w:proofErr w:type="spellEnd"/>
+            <w:r>
+              <w:rPr>
+                <w:color w:val="24303B"/>
+              </w:rPr>
+              <w:t xml:space="preserve"> gewrichten</w:t>
             </w:r>
           </w:p>
         </w:tc>
@@ -725,7 +794,6 @@
             </w:pPr>
             <w:r>
               <w:rPr>
-                <w:rFonts w:ascii="Arial" w:hAnsi="Arial" w:cs="Arial" w:eastAsia="Arial"/>
                 <w:color w:val="24303B"/>
               </w:rPr>
               <w:t>Een actief voetzweer of een Charcot-deformiteit hebben</w:t>
@@ -767,7 +835,6 @@
             </w:pPr>
             <w:r>
               <w:rPr>
-                <w:rFonts w:ascii="Arial" w:hAnsi="Arial" w:cs="Arial" w:eastAsia="Arial"/>
                 <w:color w:val="24303B"/>
               </w:rPr>
               <w:t>Hemodialyse ondergaan</w:t>
@@ -809,7 +876,6 @@
             </w:pPr>
             <w:r>
               <w:rPr>
-                <w:rFonts w:ascii="Arial" w:hAnsi="Arial" w:cs="Arial" w:eastAsia="Arial"/>
                 <w:color w:val="24303B"/>
               </w:rPr>
               <w:t>Een ernstige aandoening hebben die de overleving binnen 18 maanden beperkt (beoordeeld door de behandelende arts)</w:t>
@@ -851,7 +917,6 @@
             </w:pPr>
             <w:r>
               <w:rPr>
-                <w:rFonts w:ascii="Arial" w:hAnsi="Arial" w:cs="Arial" w:eastAsia="Arial"/>
                 <w:color w:val="24303B"/>
               </w:rPr>
               <w:t>Niet in staat zijn om toestemming te geven of de studie-instructies te volgen</w:t>
@@ -893,7 +958,6 @@
             </w:pPr>
             <w:r>
               <w:rPr>
-                <w:rFonts w:ascii="Arial" w:hAnsi="Arial" w:cs="Arial" w:eastAsia="Arial"/>
                 <w:color w:val="24303B"/>
               </w:rPr>
               <w:t>Hulpmiddelen gebruiken die de toepassing van druksensoren beperken (bv. enkel-voetorthese)</w:t>
@@ -935,7 +999,6 @@
             </w:pPr>
             <w:r>
               <w:rPr>
-                <w:rFonts w:ascii="Arial" w:hAnsi="Arial" w:cs="Arial" w:eastAsia="Arial"/>
                 <w:color w:val="24303B"/>
               </w:rPr>
               <w:t>Weigeren het voorgeschreven beschermend schoeisel te dragen</w:t>
@@ -967,12 +1030,10 @@
       </w:pPr>
       <w:r>
         <w:rPr>
-          <w:rFonts w:ascii="Arial" w:hAnsi="Arial" w:cs="Arial" w:eastAsia="Arial"/>
           <w:b/>
           <w:bCs/>
           <w:color w:val="123A5F"/>
         </w:rPr>
-        <w:lastRenderedPageBreak/>
         <w:t>Motivatie voor exclusie</w:t>
       </w:r>
     </w:p>
@@ -1047,8 +1108,8 @@
     </w:tbl>
     <w:p/>
     <w:sectPr>
-      <w:headerReference w:type="default" r:id="rId13"/>
-      <w:footerReference w:type="default" r:id="rId14"/>
+      <w:headerReference w:type="default" r:id="rId9"/>
+      <w:footerReference w:type="default" r:id="rId10"/>
       <w:pgSz w:w="11906" w:h="16838"/>
       <w:pgMar w:top="1440" w:right="1440" w:bottom="1440" w:left="1440" w:header="708" w:footer="708" w:gutter="0"/>
       <w:cols w:space="708"/>
@@ -1059,7 +1120,7 @@
 </file>
 
 <file path=word/endnotes.xml><?xml version="1.0" encoding="utf-8"?>
-<w:endnotes xmlns:wpc="http://schemas.microsoft.com/office/word/2010/wordprocessingCanvas" xmlns:cx="http://schemas.microsoft.com/office/drawing/2014/chartex" xmlns:cx1="http://schemas.microsoft.com/office/drawing/2015/9/8/chartex" xmlns:cx2="http://schemas.microsoft.com/office/drawing/2015/10/21/chartex" xmlns:cx3="http://schemas.microsoft.com/office/drawing/2016/5/9/chartex" xmlns:cx4="http://schemas.microsoft.com/office/drawing/2016/5/10/chartex" xmlns:cx5="http://schemas.microsoft.com/office/drawing/2016/5/11/chartex" xmlns:cx6="http://schemas.microsoft.com/office/drawing/2016/5/12/chartex" xmlns:cx7="http://schemas.microsoft.com/office/drawing/2016/5/13/chartex" xmlns:cx8="http://schemas.microsoft.com/office/drawing/2016/5/14/chartex" xmlns:mc="http://schemas.openxmlformats.org/markup-compatibility/2006" xmlns:aink="http://schemas.microsoft.com/office/drawing/2016/ink" xmlns:am3d="http://schemas.microsoft.com/office/drawing/2017/model3d" xmlns:o="urn:schemas-microsoft-com:office:office" xmlns:oel="http://schemas.microsoft.com/office/2019/extlst" xmlns:r="http://schemas.openxmlformats.org/officeDocument/2006/relationships" xmlns:m="http://schemas.openxmlformats.org/officeDocument/2006/math" xmlns:v="urn:schemas-microsoft-com:vml" xmlns:wp14="http://schemas.microsoft.com/office/word/2010/wordprocessingDrawing" xmlns:wp="http://schemas.openxmlformats.org/drawingml/2006/wordprocessingDrawing" xmlns:w10="urn:schemas-microsoft-com:office:word" xmlns:w="http://schemas.openxmlformats.org/wordprocessingml/2006/main" xmlns:w14="http://schemas.microsoft.com/office/word/2010/wordml" xmlns:w15="http://schemas.microsoft.com/office/word/2012/wordml" xmlns:w16cex="http://schemas.microsoft.com/office/word/2018/wordml/cex" xmlns:w16cid="http://schemas.microsoft.com/office/word/2016/wordml/cid" xmlns:w16="http://schemas.microsoft.com/office/word/2018/wordml" xmlns:w16du="http://schemas.microsoft.com/office/word/2023/wordml/word16du" xmlns:w16sdtdh="http://schemas.microsoft.com/office/word/2020/wordml/sdtdatahash" xmlns:w16sdtfl="http://schemas.microsoft.com/office/word/2024/wordml/sdtformatlock" xmlns:w16se="http://schemas.microsoft.com/office/word/2015/wordml/symex" xmlns:wpg="http://schemas.microsoft.com/office/word/2010/wordprocessingGroup" xmlns:wpi="http://schemas.microsoft.com/office/word/2010/wordprocessingInk" xmlns:wne="http://schemas.microsoft.com/office/word/2006/wordml" xmlns:wps="http://schemas.microsoft.com/office/word/2010/wordprocessingShape" mc:Ignorable="w14 w15 w16se w16cid w16 w16cex w16sdtdh w16sdtfl w16du wp14">
+<w:endnotes xmlns:wpc="http://schemas.microsoft.com/office/word/2010/wordprocessingCanvas" xmlns:cx="http://schemas.microsoft.com/office/drawing/2014/chartex" xmlns:cx1="http://schemas.microsoft.com/office/drawing/2015/9/8/chartex" xmlns:cx2="http://schemas.microsoft.com/office/drawing/2015/10/21/chartex" xmlns:cx3="http://schemas.microsoft.com/office/drawing/2016/5/9/chartex" xmlns:cx4="http://schemas.microsoft.com/office/drawing/2016/5/10/chartex" xmlns:cx5="http://schemas.microsoft.com/office/drawing/2016/5/11/chartex" xmlns:cx6="http://schemas.microsoft.com/office/drawing/2016/5/12/chartex" xmlns:cx7="http://schemas.microsoft.com/office/drawing/2016/5/13/chartex" xmlns:cx8="http://schemas.microsoft.com/office/drawing/2016/5/14/chartex" xmlns:mc="http://schemas.openxmlformats.org/markup-compatibility/2006" xmlns:aink="http://schemas.microsoft.com/office/drawing/2016/ink" xmlns:am3d="http://schemas.microsoft.com/office/drawing/2017/model3d" xmlns:o="urn:schemas-microsoft-com:office:office" xmlns:oel="http://schemas.microsoft.com/office/2019/extlst" xmlns:r="http://schemas.openxmlformats.org/officeDocument/2006/relationships" xmlns:m="http://schemas.openxmlformats.org/officeDocument/2006/math" xmlns:v="urn:schemas-microsoft-com:vml" xmlns:wp14="http://schemas.microsoft.com/office/word/2010/wordprocessingDrawing" xmlns:wp="http://schemas.openxmlformats.org/drawingml/2006/wordprocessingDrawing" xmlns:w10="urn:schemas-microsoft-com:office:word" xmlns:w="http://schemas.openxmlformats.org/wordprocessingml/2006/main" xmlns:w14="http://schemas.microsoft.com/office/word/2010/wordml" xmlns:w15="http://schemas.microsoft.com/office/word/2012/wordml" xmlns:w16cei="http://schemas.microsoft.com/office/word/2026/wordml/cei" xmlns:w16cex="http://schemas.microsoft.com/office/word/2018/wordml/cex" xmlns:w16cid="http://schemas.microsoft.com/office/word/2016/wordml/cid" xmlns:w16="http://schemas.microsoft.com/office/word/2018/wordml" xmlns:w16du="http://schemas.microsoft.com/office/word/2023/wordml/word16du" xmlns:w16sdtdh="http://schemas.microsoft.com/office/word/2020/wordml/sdtdatahash" xmlns:w16sdtfl="http://schemas.microsoft.com/office/word/2024/wordml/sdtformatlock" xmlns:w16se="http://schemas.microsoft.com/office/word/2015/wordml/symex" xmlns:wpg="http://schemas.microsoft.com/office/word/2010/wordprocessingGroup" xmlns:wpi="http://schemas.microsoft.com/office/word/2010/wordprocessingInk" xmlns:wne="http://schemas.microsoft.com/office/word/2006/wordml" xmlns:wps="http://schemas.microsoft.com/office/word/2010/wordprocessingShape" mc:Ignorable="w14 w15 w16se w16cid w16 w16cex w16sdtdh w16sdtfl w16du wp14">
   <w:endnote w:type="separator" w:id="-1">
     <w:p>
       <w:pPr>
@@ -1079,197 +1140,352 @@
 
 <file path=word/footer1.xml><?xml version="1.0" encoding="utf-8"?>
 <w:ftr xmlns:wpc="http://schemas.microsoft.com/office/word/2010/wordprocessingCanvas" xmlns:cx="http://schemas.microsoft.com/office/drawing/2014/chartex" xmlns:cx1="http://schemas.microsoft.com/office/drawing/2015/9/8/chartex" xmlns:cx2="http://schemas.microsoft.com/office/drawing/2015/10/21/chartex" xmlns:cx3="http://schemas.microsoft.com/office/drawing/2016/5/9/chartex" xmlns:cx4="http://schemas.microsoft.com/office/drawing/2016/5/10/chartex" xmlns:cx5="http://schemas.microsoft.com/office/drawing/2016/5/11/chartex" xmlns:cx6="http://schemas.microsoft.com/office/drawing/2016/5/12/chartex" xmlns:cx7="http://schemas.microsoft.com/office/drawing/2016/5/13/chartex" xmlns:cx8="http://schemas.microsoft.com/office/drawing/2016/5/14/chartex" xmlns:mc="http://schemas.openxmlformats.org/markup-compatibility/2006" xmlns:aink="http://schemas.microsoft.com/office/drawing/2016/ink" xmlns:am3d="http://schemas.microsoft.com/office/drawing/2017/model3d" xmlns:o="urn:schemas-microsoft-com:office:office" xmlns:oel="http://schemas.microsoft.com/office/2019/extlst" xmlns:r="http://schemas.openxmlformats.org/officeDocument/2006/relationships" xmlns:m="http://schemas.openxmlformats.org/officeDocument/2006/math" xmlns:v="urn:schemas-microsoft-com:vml" xmlns:wp14="http://schemas.microsoft.com/office/word/2010/wordprocessingDrawing" xmlns:wp="http://schemas.openxmlformats.org/drawingml/2006/wordprocessingDrawing" xmlns:w10="urn:schemas-microsoft-com:office:word" xmlns:w="http://schemas.openxmlformats.org/wordprocessingml/2006/main" xmlns:w14="http://schemas.microsoft.com/office/word/2010/wordml" xmlns:w15="http://schemas.microsoft.com/office/word/2012/wordml" xmlns:w16cex="http://schemas.microsoft.com/office/word/2018/wordml/cex" xmlns:w16cid="http://schemas.microsoft.com/office/word/2016/wordml/cid" xmlns:w16="http://schemas.microsoft.com/office/word/2018/wordml" xmlns:w16du="http://schemas.microsoft.com/office/word/2023/wordml/word16du" xmlns:w16sdtdh="http://schemas.microsoft.com/office/word/2020/wordml/sdtdatahash" xmlns:w16sdtfl="http://schemas.microsoft.com/office/word/2024/wordml/sdtformatlock" xmlns:w16se="http://schemas.microsoft.com/office/word/2015/wordml/symex" xmlns:wpg="http://schemas.microsoft.com/office/word/2010/wordprocessingGroup" xmlns:wpi="http://schemas.microsoft.com/office/word/2010/wordprocessingInk" xmlns:wne="http://schemas.microsoft.com/office/word/2006/wordml" xmlns:wps="http://schemas.microsoft.com/office/word/2010/wordprocessingShape" mc:Ignorable="w14 w15 w16se w16cid w16 w16cex w16sdtdh w16sdtfl w16du wp14">
-  <w:sdt>
-    <w:sdtPr>
-      <w:id w:val="931316503"/>
-      <w:docPartObj>
-        <w:docPartGallery w:val="Page Numbers (Bottom of Page)"/>
-        <w:docPartUnique/>
-      </w:docPartObj>
-    </w:sdtPr>
-    <w:sdtEndPr>
-      <w:rPr>
-        <w:color w:val="7F7F7F" w:themeColor="background1" w:themeShade="7F"/>
-        <w:spacing w:val="60"/>
-      </w:rPr>
-    </w:sdtEndPr>
-    <w:sdtContent>
-      <w:p>
-        <w:pPr>
-          <w:pStyle w:val="Voettekst"/>
-          <w:pBdr>
-            <w:top w:val="single" w:sz="4" w:space="1" w:color="D9D9D9" w:themeColor="background1" w:themeShade="D9"/>
-          </w:pBdr>
-          <w:jc w:val="right"/>
-        </w:pPr>
-        <w:r>
-          <w:rPr>
-            <w:rFonts w:ascii="Calibri" w:hAnsi="Calibri" w:cs="Calibri"/>
-            <w:color w:val="000000" w:themeColor="text1"/>
-          </w:rPr>
-          <w:fldChar w:fldCharType="begin"/>
-        </w:r>
-        <w:r>
-          <w:rPr>
-            <w:rFonts w:ascii="Calibri" w:hAnsi="Calibri" w:cs="Calibri"/>
-            <w:color w:val="000000" w:themeColor="text1"/>
-          </w:rPr>
-          <w:instrText xml:space="preserve"> PAGE   \* MERGEFORMAT </w:instrText>
-        </w:r>
-        <w:r>
-          <w:rPr>
-            <w:rFonts w:ascii="Calibri" w:hAnsi="Calibri" w:cs="Calibri"/>
-            <w:color w:val="000000" w:themeColor="text1"/>
-          </w:rPr>
-          <w:fldChar w:fldCharType="separate"/>
-        </w:r>
-        <w:r>
-          <w:rPr>
-            <w:rFonts w:ascii="Calibri" w:hAnsi="Calibri" w:cs="Calibri"/>
-            <w:noProof/>
-            <w:color w:val="000000" w:themeColor="text1"/>
-          </w:rPr>
-          <w:t>2</w:t>
-        </w:r>
-        <w:r>
-          <w:rPr>
-            <w:rFonts w:ascii="Calibri" w:hAnsi="Calibri" w:cs="Calibri"/>
-            <w:noProof/>
-            <w:color w:val="000000" w:themeColor="text1"/>
-          </w:rPr>
-          <w:fldChar w:fldCharType="end"/>
-        </w:r>
-        <w:r>
-          <w:rPr>
-            <w:rFonts w:ascii="Calibri" w:hAnsi="Calibri" w:cs="Calibri"/>
-            <w:color w:val="000000" w:themeColor="text1"/>
-          </w:rPr>
-          <w:t xml:space="preserve"> | </w:t>
-        </w:r>
-        <w:r>
-          <w:rPr>
-            <w:rFonts w:ascii="Calibri" w:hAnsi="Calibri" w:cs="Calibri"/>
-            <w:color w:val="000000" w:themeColor="text1"/>
-            <w:spacing w:val="60"/>
-          </w:rPr>
-          <w:t>2</w:t>
-        </w:r>
-      </w:p>
-    </w:sdtContent>
-  </w:sdt>
   <w:p>
     <w:pPr>
-      <w:pStyle w:val="Voettekst"/>
-      <w:jc w:val="center"/>
-      <w:rPr>
-        <w:rFonts w:ascii="Calibri" w:hAnsi="Calibri" w:cs="Calibri"/>
-      </w:rPr>
+      <w:pBdr>
+        <w:top w:val="single" w:sz="6" w:space="6" w:color="C4CED8"/>
+      </w:pBdr>
     </w:pPr>
     <w:r>
       <w:rPr>
-        <w:rFonts w:ascii="Arial" w:hAnsi="Arial" w:eastAsia="Arial" w:cs="Arial"/>
-        <w:b w:val="0"/>
-        <w:color w:val="59636E"/>
-        <w:sz w:val="18"/>
-      </w:rPr>
-      <w:t xml:space="preserve">Pagina </w:t>
+        <w:noProof/>
+      </w:rPr>
+      <w:drawing>
+        <wp:anchor distT="0" distB="0" distL="114300" distR="114300" simplePos="0" relativeHeight="251659264" behindDoc="0" locked="0" layoutInCell="1" allowOverlap="1" wp14:anchorId="4A8142CD" wp14:editId="6CB4EA88">
+          <wp:simplePos x="0" y="0"/>
+          <wp:positionH relativeFrom="column">
+            <wp:posOffset>5527362</wp:posOffset>
+          </wp:positionH>
+          <wp:positionV relativeFrom="paragraph">
+            <wp:posOffset>66098</wp:posOffset>
+          </wp:positionV>
+          <wp:extent cx="1272540" cy="484505"/>
+          <wp:effectExtent l="0" t="0" r="3810" b="0"/>
+          <wp:wrapSquare wrapText="bothSides"/>
+          <wp:docPr id="1206673644" name="Afbeelding 7"/>
+          <wp:cNvGraphicFramePr>
+            <a:graphicFrameLocks xmlns:a="http://schemas.openxmlformats.org/drawingml/2006/main" noChangeAspect="1"/>
+          </wp:cNvGraphicFramePr>
+          <a:graphic xmlns:a="http://schemas.openxmlformats.org/drawingml/2006/main">
+            <a:graphicData uri="http://schemas.openxmlformats.org/drawingml/2006/picture">
+              <pic:pic xmlns:pic="http://schemas.openxmlformats.org/drawingml/2006/picture">
+                <pic:nvPicPr>
+                  <pic:cNvPr id="1340115081" name="Afbeelding 1340115081"/>
+                  <pic:cNvPicPr/>
+                </pic:nvPicPr>
+                <pic:blipFill rotWithShape="1">
+                  <a:blip r:embed="rIdTplImgC">
+                    <a:extLst>
+                      <a:ext uri="{28A0092B-C50C-407E-A947-70E740481C1C}">
+                        <a14:useLocalDpi xmlns:a14="http://schemas.microsoft.com/office/drawing/2010/main" val="0"/>
+                      </a:ext>
+                    </a:extLst>
+                  </a:blip>
+                  <a:srcRect l="8409" t="28983" b="36048"/>
+                  <a:stretch>
+                    <a:fillRect/>
+                  </a:stretch>
+                </pic:blipFill>
+                <pic:spPr bwMode="auto">
+                  <a:xfrm>
+                    <a:off x="0" y="0"/>
+                    <a:ext cx="1272540" cy="484505"/>
+                  </a:xfrm>
+                  <a:prstGeom prst="rect">
+                    <a:avLst/>
+                  </a:prstGeom>
+                  <a:ln>
+                    <a:noFill/>
+                  </a:ln>
+                  <a:extLst>
+                    <a:ext uri="{53640926-AAD7-44D8-BBD7-CCE9431645EC}">
+                      <a14:shadowObscured xmlns:a14="http://schemas.microsoft.com/office/drawing/2010/main"/>
+                    </a:ext>
+                  </a:extLst>
+                </pic:spPr>
+              </pic:pic>
+            </a:graphicData>
+          </a:graphic>
+          <wp14:sizeRelH relativeFrom="page">
+            <wp14:pctWidth>0</wp14:pctWidth>
+          </wp14:sizeRelH>
+          <wp14:sizeRelV relativeFrom="page">
+            <wp14:pctHeight>0</wp14:pctHeight>
+          </wp14:sizeRelV>
+        </wp:anchor>
+      </w:drawing>
     </w:r>
     <w:r>
       <w:rPr>
-        <w:rFonts w:ascii="Arial" w:hAnsi="Arial" w:eastAsia="Arial" w:cs="Arial"/>
-        <w:b w:val="0"/>
         <w:color w:val="59636E"/>
-        <w:sz w:val="18"/>
+        <w:sz w:val="16"/>
+        <w:szCs w:val="16"/>
+      </w:rPr>
+      <w:t>PARADISE-</w:t>
+    </w:r>
+    <w:proofErr w:type="gramStart"/>
+    <w:r>
+      <w:rPr>
+        <w:color w:val="59636E"/>
+        <w:sz w:val="16"/>
+        <w:szCs w:val="16"/>
+      </w:rPr>
+      <w:t>studie  ·</w:t>
+    </w:r>
+    <w:proofErr w:type="gramEnd"/>
+    <w:r>
+      <w:rPr>
+        <w:color w:val="59636E"/>
+        <w:sz w:val="16"/>
+        <w:szCs w:val="16"/>
+      </w:rPr>
+      <w:t xml:space="preserve">  eCRF 01: Screening voor toestemming </w:t>
+    </w:r>
+    <w:proofErr w:type="gramStart"/>
+    <w:r>
+      <w:rPr>
+        <w:color w:val="59636E"/>
+        <w:sz w:val="16"/>
+        <w:szCs w:val="16"/>
+      </w:rPr>
+      <w:t>·</w:t>
+    </w:r>
+    <w:proofErr w:type="gramEnd"/>
+    <w:r>
+      <w:rPr>
+        <w:color w:val="59636E"/>
+        <w:sz w:val="16"/>
+        <w:szCs w:val="16"/>
+      </w:rPr>
+      <w:t xml:space="preserve">  Versie </w:t>
+    </w:r>
+    <w:proofErr w:type="gramStart"/>
+    <w:r>
+      <w:rPr>
+        <w:i/>
+        <w:iCs/>
+        <w:color w:val="59636E"/>
+        <w:sz w:val="16"/>
+        <w:szCs w:val="16"/>
+      </w:rPr>
+      <w:t xml:space="preserve">[ </w:t>
+    </w:r>
+    <w:r>
+      <w:rPr>
+        <w:i/>
+        <w:iCs/>
+        <w:color w:val="59636E"/>
+        <w:sz w:val="16"/>
+        <w:szCs w:val="16"/>
+      </w:rPr>
+      <w:t>1.0</w:t>
+    </w:r>
+    <w:proofErr w:type="gramEnd"/>
+    <w:r>
+      <w:rPr>
+        <w:i/>
+        <w:iCs/>
+        <w:color w:val="59636E"/>
+        <w:sz w:val="16"/>
+        <w:szCs w:val="16"/>
+      </w:rPr>
+      <w:t xml:space="preserve"> </w:t>
+    </w:r>
+    <w:proofErr w:type="gramStart"/>
+    <w:r>
+      <w:rPr>
+        <w:i/>
+        <w:iCs/>
+        <w:color w:val="59636E"/>
+        <w:sz w:val="16"/>
+        <w:szCs w:val="16"/>
+      </w:rPr>
+      <w:t>]</w:t>
+    </w:r>
+    <w:r>
+      <w:rPr>
+        <w:color w:val="59636E"/>
+        <w:sz w:val="16"/>
+        <w:szCs w:val="16"/>
+      </w:rPr>
+      <w:t xml:space="preserve">  ·</w:t>
+    </w:r>
+    <w:proofErr w:type="gramEnd"/>
+    <w:r>
+      <w:rPr>
+        <w:color w:val="59636E"/>
+        <w:sz w:val="16"/>
+        <w:szCs w:val="16"/>
+      </w:rPr>
+      <w:t xml:space="preserve">  </w:t>
+    </w:r>
+    <w:proofErr w:type="gramStart"/>
+    <w:r>
+      <w:rPr>
+        <w:i/>
+        <w:iCs/>
+        <w:color w:val="59636E"/>
+        <w:sz w:val="16"/>
+        <w:szCs w:val="16"/>
+      </w:rPr>
+      <w:t xml:space="preserve">[ </w:t>
+    </w:r>
+    <w:r>
+      <w:rPr>
+        <w:i/>
+        <w:iCs/>
+        <w:color w:val="59636E"/>
+        <w:sz w:val="16"/>
+        <w:szCs w:val="16"/>
+      </w:rPr>
+      <w:t>27</w:t>
+    </w:r>
+    <w:proofErr w:type="gramEnd"/>
+    <w:r>
+      <w:rPr>
+        <w:i/>
+        <w:iCs/>
+        <w:color w:val="59636E"/>
+        <w:sz w:val="16"/>
+        <w:szCs w:val="16"/>
+      </w:rPr>
+      <w:t>/07/</w:t>
+    </w:r>
+    <w:proofErr w:type="gramStart"/>
+    <w:r>
+      <w:rPr>
+        <w:i/>
+        <w:iCs/>
+        <w:color w:val="59636E"/>
+        <w:sz w:val="16"/>
+        <w:szCs w:val="16"/>
+      </w:rPr>
+      <w:t>2026</w:t>
+    </w:r>
+    <w:r>
+      <w:rPr>
+        <w:i/>
+        <w:iCs/>
+        <w:color w:val="59636E"/>
+        <w:sz w:val="16"/>
+        <w:szCs w:val="16"/>
+      </w:rPr>
+      <w:t xml:space="preserve"> ]</w:t>
+    </w:r>
+    <w:proofErr w:type="gramEnd"/>
+    <w:r>
+      <w:rPr>
+        <w:color w:val="59636E"/>
+        <w:sz w:val="16"/>
+        <w:szCs w:val="16"/>
+      </w:rPr>
+      <w:t xml:space="preserve">  </w:t>
+    </w:r>
+    <w:proofErr w:type="gramStart"/>
+    <w:r>
+      <w:rPr>
+        <w:color w:val="59636E"/>
+        <w:sz w:val="16"/>
+        <w:szCs w:val="16"/>
+      </w:rPr>
+      <w:t>·  Pagina</w:t>
+    </w:r>
+    <w:proofErr w:type="gramEnd"/>
+    <w:r>
+      <w:rPr>
+        <w:color w:val="59636E"/>
+        <w:sz w:val="16"/>
+        <w:szCs w:val="16"/>
+      </w:rPr>
+      <w:t xml:space="preserve"> </w:t>
+    </w:r>
+    <w:r>
+      <w:rPr>
+        <w:color w:val="59636E"/>
+        <w:sz w:val="16"/>
+        <w:szCs w:val="16"/>
       </w:rPr>
       <w:fldChar w:fldCharType="begin"/>
     </w:r>
     <w:r>
       <w:rPr>
-        <w:rFonts w:ascii="Arial" w:hAnsi="Arial" w:eastAsia="Arial" w:cs="Arial"/>
-        <w:b w:val="0"/>
         <w:color w:val="59636E"/>
-        <w:sz w:val="18"/>
-      </w:rPr>
-      <w:instrText xml:space="preserve"> PAGE </w:instrText>
+        <w:sz w:val="16"/>
+        <w:szCs w:val="16"/>
+      </w:rPr>
+      <w:instrText>PAGE</w:instrText>
     </w:r>
     <w:r>
       <w:rPr>
-        <w:rFonts w:ascii="Arial" w:hAnsi="Arial" w:eastAsia="Arial" w:cs="Arial"/>
-        <w:b w:val="0"/>
         <w:color w:val="59636E"/>
-        <w:sz w:val="18"/>
+        <w:sz w:val="16"/>
+        <w:szCs w:val="16"/>
       </w:rPr>
       <w:fldChar w:fldCharType="separate"/>
     </w:r>
     <w:r>
       <w:rPr>
-        <w:rFonts w:ascii="Arial" w:hAnsi="Arial" w:eastAsia="Arial" w:cs="Arial"/>
-        <w:b w:val="0"/>
+        <w:noProof/>
         <w:color w:val="59636E"/>
-        <w:sz w:val="18"/>
+        <w:sz w:val="16"/>
+        <w:szCs w:val="16"/>
       </w:rPr>
       <w:t>1</w:t>
     </w:r>
     <w:r>
       <w:rPr>
-        <w:rFonts w:ascii="Arial" w:hAnsi="Arial" w:eastAsia="Arial" w:cs="Arial"/>
-        <w:b w:val="0"/>
         <w:color w:val="59636E"/>
-        <w:sz w:val="18"/>
+        <w:sz w:val="16"/>
+        <w:szCs w:val="16"/>
       </w:rPr>
       <w:fldChar w:fldCharType="end"/>
     </w:r>
     <w:r>
       <w:rPr>
-        <w:rFonts w:ascii="Arial" w:hAnsi="Arial" w:eastAsia="Arial" w:cs="Arial"/>
-        <w:b w:val="0"/>
         <w:color w:val="59636E"/>
-        <w:sz w:val="18"/>
+        <w:sz w:val="16"/>
+        <w:szCs w:val="16"/>
       </w:rPr>
       <w:t xml:space="preserve"> van </w:t>
     </w:r>
     <w:r>
       <w:rPr>
-        <w:rFonts w:ascii="Arial" w:hAnsi="Arial" w:eastAsia="Arial" w:cs="Arial"/>
-        <w:b w:val="0"/>
         <w:color w:val="59636E"/>
-        <w:sz w:val="18"/>
+        <w:sz w:val="16"/>
+        <w:szCs w:val="16"/>
       </w:rPr>
       <w:fldChar w:fldCharType="begin"/>
     </w:r>
     <w:r>
       <w:rPr>
-        <w:rFonts w:ascii="Arial" w:hAnsi="Arial" w:eastAsia="Arial" w:cs="Arial"/>
-        <w:b w:val="0"/>
         <w:color w:val="59636E"/>
-        <w:sz w:val="18"/>
-      </w:rPr>
-      <w:instrText xml:space="preserve"> NUMPAGES </w:instrText>
+        <w:sz w:val="16"/>
+        <w:szCs w:val="16"/>
+      </w:rPr>
+      <w:instrText>NUMPAGES</w:instrText>
     </w:r>
     <w:r>
       <w:rPr>
-        <w:rFonts w:ascii="Arial" w:hAnsi="Arial" w:eastAsia="Arial" w:cs="Arial"/>
-        <w:b w:val="0"/>
         <w:color w:val="59636E"/>
-        <w:sz w:val="18"/>
+        <w:sz w:val="16"/>
+        <w:szCs w:val="16"/>
       </w:rPr>
       <w:fldChar w:fldCharType="separate"/>
     </w:r>
     <w:r>
       <w:rPr>
-        <w:rFonts w:ascii="Arial" w:hAnsi="Arial" w:eastAsia="Arial" w:cs="Arial"/>
-        <w:b w:val="0"/>
+        <w:noProof/>
         <w:color w:val="59636E"/>
-        <w:sz w:val="18"/>
-      </w:rPr>
-      <w:t>1</w:t>
+        <w:sz w:val="16"/>
+        <w:szCs w:val="16"/>
+      </w:rPr>
+      <w:t>2</w:t>
     </w:r>
     <w:r>
       <w:rPr>
-        <w:rFonts w:ascii="Arial" w:hAnsi="Arial" w:eastAsia="Arial" w:cs="Arial"/>
-        <w:b w:val="0"/>
         <w:color w:val="59636E"/>
-        <w:sz w:val="18"/>
+        <w:sz w:val="16"/>
+        <w:szCs w:val="16"/>
       </w:rPr>
       <w:fldChar w:fldCharType="end"/>
     </w:r>
@@ -1278,7 +1494,7 @@
 </file>
 
 <file path=word/footnotes.xml><?xml version="1.0" encoding="utf-8"?>
-<w:footnotes xmlns:wpc="http://schemas.microsoft.com/office/word/2010/wordprocessingCanvas" xmlns:cx="http://schemas.microsoft.com/office/drawing/2014/chartex" xmlns:cx1="http://schemas.microsoft.com/office/drawing/2015/9/8/chartex" xmlns:cx2="http://schemas.microsoft.com/office/drawing/2015/10/21/chartex" xmlns:cx3="http://schemas.microsoft.com/office/drawing/2016/5/9/chartex" xmlns:cx4="http://schemas.microsoft.com/office/drawing/2016/5/10/chartex" xmlns:cx5="http://schemas.microsoft.com/office/drawing/2016/5/11/chartex" xmlns:cx6="http://schemas.microsoft.com/office/drawing/2016/5/12/chartex" xmlns:cx7="http://schemas.microsoft.com/office/drawing/2016/5/13/chartex" xmlns:cx8="http://schemas.microsoft.com/office/drawing/2016/5/14/chartex" xmlns:mc="http://schemas.openxmlformats.org/markup-compatibility/2006" xmlns:aink="http://schemas.microsoft.com/office/drawing/2016/ink" xmlns:am3d="http://schemas.microsoft.com/office/drawing/2017/model3d" xmlns:o="urn:schemas-microsoft-com:office:office" xmlns:oel="http://schemas.microsoft.com/office/2019/extlst" xmlns:r="http://schemas.openxmlformats.org/officeDocument/2006/relationships" xmlns:m="http://schemas.openxmlformats.org/officeDocument/2006/math" xmlns:v="urn:schemas-microsoft-com:vml" xmlns:wp14="http://schemas.microsoft.com/office/word/2010/wordprocessingDrawing" xmlns:wp="http://schemas.openxmlformats.org/drawingml/2006/wordprocessingDrawing" xmlns:w10="urn:schemas-microsoft-com:office:word" xmlns:w="http://schemas.openxmlformats.org/wordprocessingml/2006/main" xmlns:w14="http://schemas.microsoft.com/office/word/2010/wordml" xmlns:w15="http://schemas.microsoft.com/office/word/2012/wordml" xmlns:w16cex="http://schemas.microsoft.com/office/word/2018/wordml/cex" xmlns:w16cid="http://schemas.microsoft.com/office/word/2016/wordml/cid" xmlns:w16="http://schemas.microsoft.com/office/word/2018/wordml" xmlns:w16du="http://schemas.microsoft.com/office/word/2023/wordml/word16du" xmlns:w16sdtdh="http://schemas.microsoft.com/office/word/2020/wordml/sdtdatahash" xmlns:w16sdtfl="http://schemas.microsoft.com/office/word/2024/wordml/sdtformatlock" xmlns:w16se="http://schemas.microsoft.com/office/word/2015/wordml/symex" xmlns:wpg="http://schemas.microsoft.com/office/word/2010/wordprocessingGroup" xmlns:wpi="http://schemas.microsoft.com/office/word/2010/wordprocessingInk" xmlns:wne="http://schemas.microsoft.com/office/word/2006/wordml" xmlns:wps="http://schemas.microsoft.com/office/word/2010/wordprocessingShape" mc:Ignorable="w14 w15 w16se w16cid w16 w16cex w16sdtdh w16sdtfl w16du wp14">
+<w:footnotes xmlns:wpc="http://schemas.microsoft.com/office/word/2010/wordprocessingCanvas" xmlns:cx="http://schemas.microsoft.com/office/drawing/2014/chartex" xmlns:cx1="http://schemas.microsoft.com/office/drawing/2015/9/8/chartex" xmlns:cx2="http://schemas.microsoft.com/office/drawing/2015/10/21/chartex" xmlns:cx3="http://schemas.microsoft.com/office/drawing/2016/5/9/chartex" xmlns:cx4="http://schemas.microsoft.com/office/drawing/2016/5/10/chartex" xmlns:cx5="http://schemas.microsoft.com/office/drawing/2016/5/11/chartex" xmlns:cx6="http://schemas.microsoft.com/office/drawing/2016/5/12/chartex" xmlns:cx7="http://schemas.microsoft.com/office/drawing/2016/5/13/chartex" xmlns:cx8="http://schemas.microsoft.com/office/drawing/2016/5/14/chartex" xmlns:mc="http://schemas.openxmlformats.org/markup-compatibility/2006" xmlns:aink="http://schemas.microsoft.com/office/drawing/2016/ink" xmlns:am3d="http://schemas.microsoft.com/office/drawing/2017/model3d" xmlns:o="urn:schemas-microsoft-com:office:office" xmlns:oel="http://schemas.microsoft.com/office/2019/extlst" xmlns:r="http://schemas.openxmlformats.org/officeDocument/2006/relationships" xmlns:m="http://schemas.openxmlformats.org/officeDocument/2006/math" xmlns:v="urn:schemas-microsoft-com:vml" xmlns:wp14="http://schemas.microsoft.com/office/word/2010/wordprocessingDrawing" xmlns:wp="http://schemas.openxmlformats.org/drawingml/2006/wordprocessingDrawing" xmlns:w10="urn:schemas-microsoft-com:office:word" xmlns:w="http://schemas.openxmlformats.org/wordprocessingml/2006/main" xmlns:w14="http://schemas.microsoft.com/office/word/2010/wordml" xmlns:w15="http://schemas.microsoft.com/office/word/2012/wordml" xmlns:w16cei="http://schemas.microsoft.com/office/word/2026/wordml/cei" xmlns:w16cex="http://schemas.microsoft.com/office/word/2018/wordml/cex" xmlns:w16cid="http://schemas.microsoft.com/office/word/2016/wordml/cid" xmlns:w16="http://schemas.microsoft.com/office/word/2018/wordml" xmlns:w16du="http://schemas.microsoft.com/office/word/2023/wordml/word16du" xmlns:w16sdtdh="http://schemas.microsoft.com/office/word/2020/wordml/sdtdatahash" xmlns:w16sdtfl="http://schemas.microsoft.com/office/word/2024/wordml/sdtformatlock" xmlns:w16se="http://schemas.microsoft.com/office/word/2015/wordml/symex" xmlns:wpg="http://schemas.microsoft.com/office/word/2010/wordprocessingGroup" xmlns:wpi="http://schemas.microsoft.com/office/word/2010/wordprocessingInk" xmlns:wne="http://schemas.microsoft.com/office/word/2006/wordml" xmlns:wps="http://schemas.microsoft.com/office/word/2010/wordprocessingShape" mc:Ignorable="w14 w15 w16se w16cid w16 w16cex w16sdtdh w16sdtfl w16du wp14">
   <w:footnote w:type="separator" w:id="-1">
     <w:p>
       <w:pPr>
@@ -1301,34 +1517,129 @@
   <w:p>
     <w:pPr>
       <w:pStyle w:val="Koptekst"/>
-      <w:jc w:val="left"/>
-      <w:rPr>
-        <w:color w:val="000000" w:themeColor="text1"/>
-        <w:sz w:val="18"/>
-        <w:szCs w:val="18"/>
-        <w:lang w:val="en-GB"/>
-      </w:rPr>
+      <w:jc w:val="right"/>
     </w:pPr>
     <w:r>
       <w:rPr>
-        <w:rFonts w:ascii="Arial" w:hAnsi="Arial" w:cs="Arial" w:eastAsia="Arial"/>
-        <w:b w:val="0"/>
-        <w:color w:val="59636E"/>
-        <w:sz w:val="18"/>
-        <w:lang w:val="en-GB"/>
-      </w:rPr>
-      <w:t>PARADISE (S71769) — eCRF 01: Screening voor toestemming</w:t>
+        <w:noProof/>
+      </w:rPr>
+      <w:drawing>
+        <wp:anchor distT="0" distB="0" distL="114300" distR="114300" simplePos="0" relativeHeight="251658240" behindDoc="1" locked="0" layoutInCell="1" allowOverlap="1" wp14:anchorId="755D2A89" wp14:editId="42F71064">
+          <wp:simplePos x="0" y="0"/>
+          <wp:positionH relativeFrom="margin">
+            <wp:align>left</wp:align>
+          </wp:positionH>
+          <wp:positionV relativeFrom="paragraph">
+            <wp:posOffset>-20955</wp:posOffset>
+          </wp:positionV>
+          <wp:extent cx="1615079" cy="720000"/>
+          <wp:effectExtent l="0" t="0" r="0" b="0"/>
+          <wp:wrapTight wrapText="bothSides">
+            <wp:wrapPolygon edited="0">
+              <wp:start x="510" y="1716"/>
+              <wp:lineTo x="255" y="5719"/>
+              <wp:lineTo x="764" y="20018"/>
+              <wp:lineTo x="8664" y="20018"/>
+              <wp:lineTo x="13250" y="18874"/>
+              <wp:lineTo x="20895" y="14298"/>
+              <wp:lineTo x="20895" y="9151"/>
+              <wp:lineTo x="14015" y="4004"/>
+              <wp:lineTo x="8664" y="1716"/>
+              <wp:lineTo x="510" y="1716"/>
+            </wp:wrapPolygon>
+          </wp:wrapTight>
+          <wp:docPr id="1820294796" name="Afbeelding 5"/>
+          <wp:cNvGraphicFramePr>
+            <a:graphicFrameLocks xmlns:a="http://schemas.openxmlformats.org/drawingml/2006/main" noChangeAspect="1"/>
+          </wp:cNvGraphicFramePr>
+          <a:graphic xmlns:a="http://schemas.openxmlformats.org/drawingml/2006/main">
+            <a:graphicData uri="http://schemas.openxmlformats.org/drawingml/2006/picture">
+              <pic:pic xmlns:pic="http://schemas.openxmlformats.org/drawingml/2006/picture">
+                <pic:nvPicPr>
+                  <pic:cNvPr id="1820294796" name="Afbeelding 1820294796"/>
+                  <pic:cNvPicPr/>
+                </pic:nvPicPr>
+                <pic:blipFill>
+                  <a:blip r:embed="rIdTplImgA">
+                    <a:extLst>
+                      <a:ext uri="{28A0092B-C50C-407E-A947-70E740481C1C}">
+                        <a14:useLocalDpi xmlns:a14="http://schemas.microsoft.com/office/drawing/2010/main" val="0"/>
+                      </a:ext>
+                    </a:extLst>
+                  </a:blip>
+                  <a:stretch>
+                    <a:fillRect/>
+                  </a:stretch>
+                </pic:blipFill>
+                <pic:spPr>
+                  <a:xfrm>
+                    <a:off x="0" y="0"/>
+                    <a:ext cx="1615079" cy="720000"/>
+                  </a:xfrm>
+                  <a:prstGeom prst="rect">
+                    <a:avLst/>
+                  </a:prstGeom>
+                </pic:spPr>
+              </pic:pic>
+            </a:graphicData>
+          </a:graphic>
+          <wp14:sizeRelH relativeFrom="page">
+            <wp14:pctWidth>0</wp14:pctWidth>
+          </wp14:sizeRelH>
+          <wp14:sizeRelV relativeFrom="page">
+            <wp14:pctHeight>0</wp14:pctHeight>
+          </wp14:sizeRelV>
+        </wp:anchor>
+      </w:drawing>
+    </w:r>
+    <w:r>
+      <w:rPr>
+        <w:noProof/>
+      </w:rPr>
+      <w:drawing>
+        <wp:inline distT="0" distB="0" distL="0" distR="0" wp14:anchorId="4E8F3C53" wp14:editId="680A2799">
+          <wp:extent cx="2525825" cy="720000"/>
+          <wp:effectExtent l="0" t="0" r="0" b="4445"/>
+          <wp:docPr id="328170997" name="Afbeelding 6"/>
+          <wp:cNvGraphicFramePr>
+            <a:graphicFrameLocks xmlns:a="http://schemas.openxmlformats.org/drawingml/2006/main" noChangeAspect="1"/>
+          </wp:cNvGraphicFramePr>
+          <a:graphic xmlns:a="http://schemas.openxmlformats.org/drawingml/2006/main">
+            <a:graphicData uri="http://schemas.openxmlformats.org/drawingml/2006/picture">
+              <pic:pic xmlns:pic="http://schemas.openxmlformats.org/drawingml/2006/picture">
+                <pic:nvPicPr>
+                  <pic:cNvPr id="328170997" name="Afbeelding 328170997"/>
+                  <pic:cNvPicPr/>
+                </pic:nvPicPr>
+                <pic:blipFill>
+                  <a:blip r:embed="rIdTplImgB">
+                    <a:extLst>
+                      <a:ext uri="{28A0092B-C50C-407E-A947-70E740481C1C}">
+                        <a14:useLocalDpi xmlns:a14="http://schemas.microsoft.com/office/drawing/2010/main" val="0"/>
+                      </a:ext>
+                    </a:extLst>
+                  </a:blip>
+                  <a:stretch>
+                    <a:fillRect/>
+                  </a:stretch>
+                </pic:blipFill>
+                <pic:spPr>
+                  <a:xfrm>
+                    <a:off x="0" y="0"/>
+                    <a:ext cx="2525825" cy="720000"/>
+                  </a:xfrm>
+                  <a:prstGeom prst="rect">
+                    <a:avLst/>
+                  </a:prstGeom>
+                </pic:spPr>
+              </pic:pic>
+            </a:graphicData>
+          </a:graphic>
+        </wp:inline>
+      </w:drawing>
     </w:r>
   </w:p>
 </w:hdr>
-</file>
-
-<file path=word/people.xml><?xml version="1.0" encoding="utf-8"?>
-<w15:people xmlns:wpc="http://schemas.microsoft.com/office/word/2010/wordprocessingCanvas" xmlns:cx="http://schemas.microsoft.com/office/drawing/2014/chartex" xmlns:cx1="http://schemas.microsoft.com/office/drawing/2015/9/8/chartex" xmlns:cx2="http://schemas.microsoft.com/office/drawing/2015/10/21/chartex" xmlns:cx3="http://schemas.microsoft.com/office/drawing/2016/5/9/chartex" xmlns:cx4="http://schemas.microsoft.com/office/drawing/2016/5/10/chartex" xmlns:cx5="http://schemas.microsoft.com/office/drawing/2016/5/11/chartex" xmlns:cx6="http://schemas.microsoft.com/office/drawing/2016/5/12/chartex" xmlns:cx7="http://schemas.microsoft.com/office/drawing/2016/5/13/chartex" xmlns:cx8="http://schemas.microsoft.com/office/drawing/2016/5/14/chartex" xmlns:mc="http://schemas.openxmlformats.org/markup-compatibility/2006" xmlns:aink="http://schemas.microsoft.com/office/drawing/2016/ink" xmlns:am3d="http://schemas.microsoft.com/office/drawing/2017/model3d" xmlns:o="urn:schemas-microsoft-com:office:office" xmlns:oel="http://schemas.microsoft.com/office/2019/extlst" xmlns:r="http://schemas.openxmlformats.org/officeDocument/2006/relationships" xmlns:m="http://schemas.openxmlformats.org/officeDocument/2006/math" xmlns:v="urn:schemas-microsoft-com:vml" xmlns:wp14="http://schemas.microsoft.com/office/word/2010/wordprocessingDrawing" xmlns:wp="http://schemas.openxmlformats.org/drawingml/2006/wordprocessingDrawing" xmlns:w10="urn:schemas-microsoft-com:office:word" xmlns:w="http://schemas.openxmlformats.org/wordprocessingml/2006/main" xmlns:w14="http://schemas.microsoft.com/office/word/2010/wordml" xmlns:w15="http://schemas.microsoft.com/office/word/2012/wordml" xmlns:w16cex="http://schemas.microsoft.com/office/word/2018/wordml/cex" xmlns:w16cid="http://schemas.microsoft.com/office/word/2016/wordml/cid" xmlns:w16="http://schemas.microsoft.com/office/word/2018/wordml" xmlns:w16du="http://schemas.microsoft.com/office/word/2023/wordml/word16du" xmlns:w16sdtdh="http://schemas.microsoft.com/office/word/2020/wordml/sdtdatahash" xmlns:w16sdtfl="http://schemas.microsoft.com/office/word/2024/wordml/sdtformatlock" xmlns:w16se="http://schemas.microsoft.com/office/word/2015/wordml/symex" xmlns:wpg="http://schemas.microsoft.com/office/word/2010/wordprocessingGroup" xmlns:wpi="http://schemas.microsoft.com/office/word/2010/wordprocessingInk" xmlns:wne="http://schemas.microsoft.com/office/word/2006/wordml" xmlns:wps="http://schemas.microsoft.com/office/word/2010/wordprocessingShape" mc:Ignorable="w14 w15 w16se w16cid w16 w16cex w16sdtdh w16sdtfl w16du wp14">
-  <w15:person w15:author="Fabienne Dobbels">
-    <w15:presenceInfo w15:providerId="AD" w15:userId="S::fabienne.dobbels@kuleuven.be::6af49e9b-5a3b-47c4-8312-83989a90b1c2"/>
-  </w15:person>
-</w15:people>
 </file>
 
 <file path=word/styles.xml><?xml version="1.0" encoding="utf-8"?>
@@ -1736,7 +2047,7 @@
       <w:spacing w:line="259" w:lineRule="auto"/>
     </w:pPr>
     <w:rPr>
-      <w:rFonts w:ascii="Arial" w:hAnsi="Arial" w:eastAsia="Arial" w:cs="Arial"/>
+      <w:rFonts w:ascii="Arial" w:eastAsia="Arial" w:hAnsi="Arial" w:cs="Arial"/>
       <w:sz w:val="22"/>
       <w:szCs w:val="22"/>
     </w:rPr>
@@ -2855,18 +3166,18 @@
 </file>
 
 <file path=customXml/item2.xml><?xml version="1.0" encoding="utf-8"?>
+<p:properties xmlns:p="http://schemas.microsoft.com/office/2006/metadata/properties" xmlns:xsi="http://www.w3.org/2001/XMLSchema-instance" xmlns:pc="http://schemas.microsoft.com/office/infopath/2007/PartnerControls">
+  <documentManagement/>
+</p:properties>
+</file>
+
+<file path=customXml/item3.xml><?xml version="1.0" encoding="utf-8"?>
 <?mso-contentType ?>
 <FormTemplates xmlns="http://schemas.microsoft.com/sharepoint/v3/contenttype/forms">
   <Display>DocumentLibraryForm</Display>
   <Edit>DocumentLibraryForm</Edit>
   <New>DocumentLibraryForm</New>
 </FormTemplates>
-</file>
-
-<file path=customXml/item3.xml><?xml version="1.0" encoding="utf-8"?>
-<p:properties xmlns:p="http://schemas.microsoft.com/office/2006/metadata/properties" xmlns:xsi="http://www.w3.org/2001/XMLSchema-instance" xmlns:pc="http://schemas.microsoft.com/office/infopath/2007/PartnerControls">
-  <documentManagement/>
-</p:properties>
 </file>
 
 <file path=customXml/itemProps1.xml><?xml version="1.0" encoding="utf-8"?>
@@ -2888,18 +3199,18 @@
 </file>
 
 <file path=customXml/itemProps2.xml><?xml version="1.0" encoding="utf-8"?>
-<ds:datastoreItem xmlns:ds="http://schemas.openxmlformats.org/officeDocument/2006/customXml" ds:itemID="{1E04EDE8-E59A-4848-8DF7-52947511014D}">
-  <ds:schemaRefs>
-    <ds:schemaRef ds:uri="http://schemas.microsoft.com/sharepoint/v3/contenttype/forms"/>
-  </ds:schemaRefs>
-</ds:datastoreItem>
-</file>
-
-<file path=customXml/itemProps3.xml><?xml version="1.0" encoding="utf-8"?>
 <ds:datastoreItem xmlns:ds="http://schemas.openxmlformats.org/officeDocument/2006/customXml" ds:itemID="{1A7F3013-63E9-429B-AB65-C3A969D65509}">
   <ds:schemaRefs>
     <ds:schemaRef ds:uri="http://schemas.microsoft.com/office/2006/metadata/properties"/>
     <ds:schemaRef ds:uri="http://schemas.microsoft.com/office/infopath/2007/PartnerControls"/>
   </ds:schemaRefs>
 </ds:datastoreItem>
+</file>
+
+<file path=customXml/itemProps3.xml><?xml version="1.0" encoding="utf-8"?>
+<ds:datastoreItem xmlns:ds="http://schemas.openxmlformats.org/officeDocument/2006/customXml" ds:itemID="{1E04EDE8-E59A-4848-8DF7-52947511014D}">
+  <ds:schemaRefs>
+    <ds:schemaRef ds:uri="http://schemas.microsoft.com/sharepoint/v3/contenttype/forms"/>
+  </ds:schemaRefs>
+</ds:datastoreItem>
 </file>
</xml_diff>

<commit_message>
eCRF: voettekst-afbeelding iets losser van de paginarand geplaatst (±1cm) en dubbele media-items in het zip-pakket opgeruimd
</commit_message>
<xml_diff>
--- a/(e)CRF/Per nummer/01_Screening voor toestemming.docx
+++ b/(e)CRF/Per nummer/01_Screening voor toestemming.docx
@@ -187,19 +187,6 @@
     </w:p>
     <w:p>
       <w:pPr>
-        <w:spacing w:line="240" w:lineRule="auto"/>
-        <w:jc w:val="both"/>
-        <w:rPr>
-          <w:rFonts w:ascii="Calibri" w:hAnsi="Calibri" w:cs="Calibri"/>
-          <w:b/>
-          <w:bCs/>
-          <w:sz w:val="26"/>
-          <w:szCs w:val="26"/>
-        </w:rPr>
-      </w:pPr>
-    </w:p>
-    <w:p>
-      <w:pPr>
         <w:spacing w:before="120" w:after="0" w:line="240" w:lineRule="auto"/>
         <w:contextualSpacing/>
         <w:rPr>
@@ -1111,7 +1098,7 @@
       <w:headerReference w:type="default" r:id="rId9"/>
       <w:footerReference w:type="default" r:id="rId10"/>
       <w:pgSz w:w="11906" w:h="16838"/>
-      <w:pgMar w:top="1440" w:right="1440" w:bottom="1440" w:left="1440" w:header="708" w:footer="708" w:gutter="0"/>
+      <w:pgMar w:top="1440" w:right="1440" w:bottom="1440" w:left="1440" w:header="709" w:footer="709" w:gutter="0"/>
       <w:cols w:space="708"/>
       <w:docGrid w:linePitch="360"/>
     </w:sectPr>
@@ -1154,7 +1141,7 @@
         <wp:anchor distT="0" distB="0" distL="114300" distR="114300" simplePos="0" relativeHeight="251659264" behindDoc="0" locked="0" layoutInCell="1" allowOverlap="1" wp14:anchorId="4A8142CD" wp14:editId="6CB4EA88">
           <wp:simplePos x="0" y="0"/>
           <wp:positionH relativeFrom="column">
-            <wp:posOffset>5527362</wp:posOffset>
+            <wp:posOffset>5351825</wp:posOffset>
           </wp:positionH>
           <wp:positionV relativeFrom="paragraph">
             <wp:posOffset>66098</wp:posOffset>
@@ -3010,6 +2997,15 @@
 </file>
 
 <file path=customXml/item1.xml><?xml version="1.0" encoding="utf-8"?>
+<?mso-contentType ?>
+<FormTemplates xmlns="http://schemas.microsoft.com/sharepoint/v3/contenttype/forms">
+  <Display>DocumentLibraryForm</Display>
+  <Edit>DocumentLibraryForm</Edit>
+  <New>DocumentLibraryForm</New>
+</FormTemplates>
+</file>
+
+<file path=customXml/item2.xml><?xml version="1.0" encoding="utf-8"?>
 <ct:contentTypeSchema xmlns:ct="http://schemas.microsoft.com/office/2006/metadata/contentType" xmlns:ma="http://schemas.microsoft.com/office/2006/metadata/properties/metaAttributes" ct:_="" ma:_="" ma:contentTypeName="Document" ma:contentTypeID="0x010100F1B33D7B57FFEC4BB77B5001C5B93838" ma:contentTypeVersion="6" ma:contentTypeDescription="Create a new document." ma:contentTypeScope="" ma:versionID="11489564a2e1eebedb75a596dc219880">
   <xsd:schema xmlns:xsd="http://www.w3.org/2001/XMLSchema" xmlns:xs="http://www.w3.org/2001/XMLSchema" xmlns:p="http://schemas.microsoft.com/office/2006/metadata/properties" xmlns:ns2="f44e6bd5-09db-4117-8b15-adf399208dc6" targetNamespace="http://schemas.microsoft.com/office/2006/metadata/properties" ma:root="true" ma:fieldsID="e3b726a9000fc3f395844b5888e6be4a" ns2:_="">
     <xsd:import namespace="f44e6bd5-09db-4117-8b15-adf399208dc6"/>
@@ -3165,22 +3161,21 @@
 </ct:contentTypeSchema>
 </file>
 
-<file path=customXml/item2.xml><?xml version="1.0" encoding="utf-8"?>
+<file path=customXml/item3.xml><?xml version="1.0" encoding="utf-8"?>
 <p:properties xmlns:p="http://schemas.microsoft.com/office/2006/metadata/properties" xmlns:xsi="http://www.w3.org/2001/XMLSchema-instance" xmlns:pc="http://schemas.microsoft.com/office/infopath/2007/PartnerControls">
   <documentManagement/>
 </p:properties>
 </file>
 
-<file path=customXml/item3.xml><?xml version="1.0" encoding="utf-8"?>
-<?mso-contentType ?>
-<FormTemplates xmlns="http://schemas.microsoft.com/sharepoint/v3/contenttype/forms">
-  <Display>DocumentLibraryForm</Display>
-  <Edit>DocumentLibraryForm</Edit>
-  <New>DocumentLibraryForm</New>
-</FormTemplates>
+<file path=customXml/itemProps1.xml><?xml version="1.0" encoding="utf-8"?>
+<ds:datastoreItem xmlns:ds="http://schemas.openxmlformats.org/officeDocument/2006/customXml" ds:itemID="{1E04EDE8-E59A-4848-8DF7-52947511014D}">
+  <ds:schemaRefs>
+    <ds:schemaRef ds:uri="http://schemas.microsoft.com/sharepoint/v3/contenttype/forms"/>
+  </ds:schemaRefs>
+</ds:datastoreItem>
 </file>
 
-<file path=customXml/itemProps1.xml><?xml version="1.0" encoding="utf-8"?>
+<file path=customXml/itemProps2.xml><?xml version="1.0" encoding="utf-8"?>
 <ds:datastoreItem xmlns:ds="http://schemas.openxmlformats.org/officeDocument/2006/customXml" ds:itemID="{A27CF86F-8ED8-4A58-A058-418E01480B23}">
   <ds:schemaRefs>
     <ds:schemaRef ds:uri="http://schemas.microsoft.com/office/2006/metadata/contentType"/>
@@ -3198,19 +3193,11 @@
 </ds:datastoreItem>
 </file>
 
-<file path=customXml/itemProps2.xml><?xml version="1.0" encoding="utf-8"?>
+<file path=customXml/itemProps3.xml><?xml version="1.0" encoding="utf-8"?>
 <ds:datastoreItem xmlns:ds="http://schemas.openxmlformats.org/officeDocument/2006/customXml" ds:itemID="{1A7F3013-63E9-429B-AB65-C3A969D65509}">
   <ds:schemaRefs>
     <ds:schemaRef ds:uri="http://schemas.microsoft.com/office/2006/metadata/properties"/>
     <ds:schemaRef ds:uri="http://schemas.microsoft.com/office/infopath/2007/PartnerControls"/>
   </ds:schemaRefs>
 </ds:datastoreItem>
-</file>
-
-<file path=customXml/itemProps3.xml><?xml version="1.0" encoding="utf-8"?>
-<ds:datastoreItem xmlns:ds="http://schemas.openxmlformats.org/officeDocument/2006/customXml" ds:itemID="{1E04EDE8-E59A-4848-8DF7-52947511014D}">
-  <ds:schemaRefs>
-    <ds:schemaRef ds:uri="http://schemas.microsoft.com/sharepoint/v3/contenttype/forms"/>
-  </ds:schemaRefs>
-</ds:datastoreItem>
 </file>
</xml_diff>